<commit_message>
Add logo images and update project document
Added three new logo images to the Proyecto/Logo directory and updated the AnteProyecto_MSB.docx document. These changes support project branding and documentation updates.
</commit_message>
<xml_diff>
--- a/Proyecto/AnteProyecto_MSB.docx
+++ b/Proyecto/AnteProyecto_MSB.docx
@@ -686,7 +686,7 @@
           <w:r>
             <w:fldChar w:fldCharType="separate"/>
           </w:r>
-          <w:hyperlink w:anchor="_Toc214449029" w:history="1">
+          <w:hyperlink w:anchor="_Toc215046688" w:history="1">
             <w:r>
               <w:rPr>
                 <w:rStyle w:val="Hipervnculo"/>
@@ -713,7 +713,7 @@
                 <w:noProof/>
                 <w:webHidden/>
               </w:rPr>
-              <w:instrText xml:space="preserve"> PAGEREF _Toc214449029 \h </w:instrText>
+              <w:instrText xml:space="preserve"> PAGEREF _Toc215046688 \h </w:instrText>
             </w:r>
             <w:r>
               <w:rPr>
@@ -758,7 +758,7 @@
               <w:lang w:eastAsia="es-ES_tradnl"/>
             </w:rPr>
           </w:pPr>
-          <w:hyperlink w:anchor="_Toc214449030" w:history="1">
+          <w:hyperlink w:anchor="_Toc215046689" w:history="1">
             <w:r>
               <w:rPr>
                 <w:rStyle w:val="Hipervnculo"/>
@@ -785,7 +785,7 @@
                 <w:noProof/>
                 <w:webHidden/>
               </w:rPr>
-              <w:instrText xml:space="preserve"> PAGEREF _Toc214449030 \h </w:instrText>
+              <w:instrText xml:space="preserve"> PAGEREF _Toc215046689 \h </w:instrText>
             </w:r>
             <w:r>
               <w:rPr>
@@ -830,7 +830,7 @@
               <w:lang w:eastAsia="es-ES_tradnl"/>
             </w:rPr>
           </w:pPr>
-          <w:hyperlink w:anchor="_Toc214449031" w:history="1">
+          <w:hyperlink w:anchor="_Toc215046690" w:history="1">
             <w:r>
               <w:rPr>
                 <w:rStyle w:val="Hipervnculo"/>
@@ -857,7 +857,7 @@
                 <w:noProof/>
                 <w:webHidden/>
               </w:rPr>
-              <w:instrText xml:space="preserve"> PAGEREF _Toc214449031 \h </w:instrText>
+              <w:instrText xml:space="preserve"> PAGEREF _Toc215046690 \h </w:instrText>
             </w:r>
             <w:r>
               <w:rPr>
@@ -902,7 +902,7 @@
               <w:lang w:eastAsia="es-ES_tradnl"/>
             </w:rPr>
           </w:pPr>
-          <w:hyperlink w:anchor="_Toc214449032" w:history="1">
+          <w:hyperlink w:anchor="_Toc215046691" w:history="1">
             <w:r>
               <w:rPr>
                 <w:rStyle w:val="Hipervnculo"/>
@@ -929,7 +929,7 @@
                 <w:noProof/>
                 <w:webHidden/>
               </w:rPr>
-              <w:instrText xml:space="preserve"> PAGEREF _Toc214449032 \h </w:instrText>
+              <w:instrText xml:space="preserve"> PAGEREF _Toc215046691 \h </w:instrText>
             </w:r>
             <w:r>
               <w:rPr>
@@ -974,7 +974,7 @@
               <w:lang w:eastAsia="es-ES_tradnl"/>
             </w:rPr>
           </w:pPr>
-          <w:hyperlink w:anchor="_Toc214449033" w:history="1">
+          <w:hyperlink w:anchor="_Toc215046692" w:history="1">
             <w:r>
               <w:rPr>
                 <w:rStyle w:val="Hipervnculo"/>
@@ -1001,7 +1001,7 @@
                 <w:noProof/>
                 <w:webHidden/>
               </w:rPr>
-              <w:instrText xml:space="preserve"> PAGEREF _Toc214449033 \h </w:instrText>
+              <w:instrText xml:space="preserve"> PAGEREF _Toc215046692 \h </w:instrText>
             </w:r>
             <w:r>
               <w:rPr>
@@ -1046,7 +1046,7 @@
               <w:lang w:eastAsia="es-ES_tradnl"/>
             </w:rPr>
           </w:pPr>
-          <w:hyperlink w:anchor="_Toc214449034" w:history="1">
+          <w:hyperlink w:anchor="_Toc215046693" w:history="1">
             <w:r>
               <w:rPr>
                 <w:rStyle w:val="Hipervnculo"/>
@@ -1073,7 +1073,7 @@
                 <w:noProof/>
                 <w:webHidden/>
               </w:rPr>
-              <w:instrText xml:space="preserve"> PAGEREF _Toc214449034 \h </w:instrText>
+              <w:instrText xml:space="preserve"> PAGEREF _Toc215046693 \h </w:instrText>
             </w:r>
             <w:r>
               <w:rPr>
@@ -1118,7 +1118,7 @@
               <w:lang w:eastAsia="es-ES_tradnl"/>
             </w:rPr>
           </w:pPr>
-          <w:hyperlink w:anchor="_Toc214449035" w:history="1">
+          <w:hyperlink w:anchor="_Toc215046694" w:history="1">
             <w:r>
               <w:rPr>
                 <w:rStyle w:val="Hipervnculo"/>
@@ -1145,7 +1145,7 @@
                 <w:noProof/>
                 <w:webHidden/>
               </w:rPr>
-              <w:instrText xml:space="preserve"> PAGEREF _Toc214449035 \h </w:instrText>
+              <w:instrText xml:space="preserve"> PAGEREF _Toc215046694 \h </w:instrText>
             </w:r>
             <w:r>
               <w:rPr>
@@ -1190,7 +1190,7 @@
               <w:lang w:eastAsia="es-ES_tradnl"/>
             </w:rPr>
           </w:pPr>
-          <w:hyperlink w:anchor="_Toc214449036" w:history="1">
+          <w:hyperlink w:anchor="_Toc215046695" w:history="1">
             <w:r>
               <w:rPr>
                 <w:rStyle w:val="Hipervnculo"/>
@@ -1217,7 +1217,7 @@
                 <w:noProof/>
                 <w:webHidden/>
               </w:rPr>
-              <w:instrText xml:space="preserve"> PAGEREF _Toc214449036 \h </w:instrText>
+              <w:instrText xml:space="preserve"> PAGEREF _Toc215046695 \h </w:instrText>
             </w:r>
             <w:r>
               <w:rPr>
@@ -1262,7 +1262,7 @@
               <w:lang w:eastAsia="es-ES_tradnl"/>
             </w:rPr>
           </w:pPr>
-          <w:hyperlink w:anchor="_Toc214449037" w:history="1">
+          <w:hyperlink w:anchor="_Toc215046696" w:history="1">
             <w:r>
               <w:rPr>
                 <w:rStyle w:val="Hipervnculo"/>
@@ -1289,7 +1289,7 @@
                 <w:noProof/>
                 <w:webHidden/>
               </w:rPr>
-              <w:instrText xml:space="preserve"> PAGEREF _Toc214449037 \h </w:instrText>
+              <w:instrText xml:space="preserve"> PAGEREF _Toc215046696 \h </w:instrText>
             </w:r>
             <w:r>
               <w:rPr>
@@ -1334,7 +1334,7 @@
               <w:lang w:eastAsia="es-ES_tradnl"/>
             </w:rPr>
           </w:pPr>
-          <w:hyperlink w:anchor="_Toc214449038" w:history="1">
+          <w:hyperlink w:anchor="_Toc215046697" w:history="1">
             <w:r>
               <w:rPr>
                 <w:rStyle w:val="Hipervnculo"/>
@@ -1361,7 +1361,7 @@
                 <w:noProof/>
                 <w:webHidden/>
               </w:rPr>
-              <w:instrText xml:space="preserve"> PAGEREF _Toc214449038 \h </w:instrText>
+              <w:instrText xml:space="preserve"> PAGEREF _Toc215046697 \h </w:instrText>
             </w:r>
             <w:r>
               <w:rPr>
@@ -1406,7 +1406,7 @@
               <w:lang w:eastAsia="es-ES_tradnl"/>
             </w:rPr>
           </w:pPr>
-          <w:hyperlink w:anchor="_Toc214449039" w:history="1">
+          <w:hyperlink w:anchor="_Toc215046698" w:history="1">
             <w:r>
               <w:rPr>
                 <w:rStyle w:val="Hipervnculo"/>
@@ -1433,7 +1433,7 @@
                 <w:noProof/>
                 <w:webHidden/>
               </w:rPr>
-              <w:instrText xml:space="preserve"> PAGEREF _Toc214449039 \h </w:instrText>
+              <w:instrText xml:space="preserve"> PAGEREF _Toc215046698 \h </w:instrText>
             </w:r>
             <w:r>
               <w:rPr>
@@ -1478,7 +1478,7 @@
               <w:lang w:eastAsia="es-ES_tradnl"/>
             </w:rPr>
           </w:pPr>
-          <w:hyperlink w:anchor="_Toc214449040" w:history="1">
+          <w:hyperlink w:anchor="_Toc215046699" w:history="1">
             <w:r>
               <w:rPr>
                 <w:rStyle w:val="Hipervnculo"/>
@@ -1505,7 +1505,7 @@
                 <w:noProof/>
                 <w:webHidden/>
               </w:rPr>
-              <w:instrText xml:space="preserve"> PAGEREF _Toc214449040 \h </w:instrText>
+              <w:instrText xml:space="preserve"> PAGEREF _Toc215046699 \h </w:instrText>
             </w:r>
             <w:r>
               <w:rPr>
@@ -1550,13 +1550,27 @@
               <w:lang w:eastAsia="es-ES_tradnl"/>
             </w:rPr>
           </w:pPr>
-          <w:hyperlink w:anchor="_Toc214449041" w:history="1">
+          <w:hyperlink w:anchor="_Toc215046700" w:history="1">
             <w:r>
               <w:rPr>
                 <w:rStyle w:val="Hipervnculo"/>
                 <w:noProof/>
               </w:rPr>
-              <w:t>9.1 Software necesario</w:t>
+              <w:t>9.1 Software n</w:t>
+            </w:r>
+            <w:r>
+              <w:rPr>
+                <w:rStyle w:val="Hipervnculo"/>
+                <w:noProof/>
+              </w:rPr>
+              <w:t>e</w:t>
+            </w:r>
+            <w:r>
+              <w:rPr>
+                <w:rStyle w:val="Hipervnculo"/>
+                <w:noProof/>
+              </w:rPr>
+              <w:t>cesario</w:t>
             </w:r>
             <w:r>
               <w:rPr>
@@ -1577,7 +1591,7 @@
                 <w:noProof/>
                 <w:webHidden/>
               </w:rPr>
-              <w:instrText xml:space="preserve"> PAGEREF _Toc214449041 \h </w:instrText>
+              <w:instrText xml:space="preserve"> PAGEREF _Toc215046700 \h </w:instrText>
             </w:r>
             <w:r>
               <w:rPr>
@@ -1622,7 +1636,7 @@
               <w:lang w:eastAsia="es-ES_tradnl"/>
             </w:rPr>
           </w:pPr>
-          <w:hyperlink w:anchor="_Toc214449042" w:history="1">
+          <w:hyperlink w:anchor="_Toc215046701" w:history="1">
             <w:r>
               <w:rPr>
                 <w:rStyle w:val="Hipervnculo"/>
@@ -1649,7 +1663,7 @@
                 <w:noProof/>
                 <w:webHidden/>
               </w:rPr>
-              <w:instrText xml:space="preserve"> PAGEREF _Toc214449042 \h </w:instrText>
+              <w:instrText xml:space="preserve"> PAGEREF _Toc215046701 \h </w:instrText>
             </w:r>
             <w:r>
               <w:rPr>
@@ -1694,7 +1708,7 @@
               <w:lang w:eastAsia="es-ES_tradnl"/>
             </w:rPr>
           </w:pPr>
-          <w:hyperlink w:anchor="_Toc214449043" w:history="1">
+          <w:hyperlink w:anchor="_Toc215046702" w:history="1">
             <w:r>
               <w:rPr>
                 <w:rStyle w:val="Hipervnculo"/>
@@ -1721,7 +1735,7 @@
                 <w:noProof/>
                 <w:webHidden/>
               </w:rPr>
-              <w:instrText xml:space="preserve"> PAGEREF _Toc214449043 \h </w:instrText>
+              <w:instrText xml:space="preserve"> PAGEREF _Toc215046702 \h </w:instrText>
             </w:r>
             <w:r>
               <w:rPr>
@@ -1772,7 +1786,7 @@
       <w:pPr>
         <w:pStyle w:val="Ttulo1"/>
       </w:pPr>
-      <w:bookmarkStart w:id="0" w:name="_Toc214449029"/>
+      <w:bookmarkStart w:id="0" w:name="_Toc215046688"/>
       <w:r>
         <w:lastRenderedPageBreak/>
         <w:t>1. Introducción</w:t>
@@ -1856,7 +1870,7 @@
       <w:pPr>
         <w:pStyle w:val="Ttulo1"/>
       </w:pPr>
-      <w:bookmarkStart w:id="1" w:name="_Toc214449030"/>
+      <w:bookmarkStart w:id="1" w:name="_Toc215046689"/>
       <w:r>
         <w:t>2. Justificación</w:t>
       </w:r>
@@ -1944,7 +1958,7 @@
       <w:pPr>
         <w:pStyle w:val="Ttulo2"/>
       </w:pPr>
-      <w:bookmarkStart w:id="2" w:name="_Toc214449031"/>
+      <w:bookmarkStart w:id="2" w:name="_Toc215046690"/>
       <w:r>
         <w:t>2.1 Estudio del arte</w:t>
       </w:r>
@@ -2166,7 +2180,7 @@
       <w:pPr>
         <w:pStyle w:val="Ttulo1"/>
       </w:pPr>
-      <w:bookmarkStart w:id="3" w:name="_Toc214449032"/>
+      <w:bookmarkStart w:id="3" w:name="_Toc215046691"/>
       <w:r>
         <w:t>3. Objetivos</w:t>
       </w:r>
@@ -2176,7 +2190,7 @@
       <w:pPr>
         <w:pStyle w:val="Ttulo2"/>
       </w:pPr>
-      <w:bookmarkStart w:id="4" w:name="_Toc214449033"/>
+      <w:bookmarkStart w:id="4" w:name="_Toc215046692"/>
       <w:r>
         <w:t>3.1. Objetivos Generales</w:t>
       </w:r>
@@ -2218,7 +2232,7 @@
       <w:pPr>
         <w:pStyle w:val="Ttulo2"/>
       </w:pPr>
-      <w:bookmarkStart w:id="5" w:name="_Toc214449034"/>
+      <w:bookmarkStart w:id="5" w:name="_Toc215046693"/>
       <w:r>
         <w:t>3.2. Objetivos Específicos</w:t>
       </w:r>
@@ -2281,7 +2295,7 @@
       <w:pPr>
         <w:pStyle w:val="Ttulo1"/>
       </w:pPr>
-      <w:bookmarkStart w:id="6" w:name="_Toc214449035"/>
+      <w:bookmarkStart w:id="6" w:name="_Toc215046694"/>
       <w:r>
         <w:t>4. Requisitos Funcionales</w:t>
       </w:r>
@@ -2480,7 +2494,7 @@
       <w:pPr>
         <w:pStyle w:val="Ttulo1"/>
       </w:pPr>
-      <w:bookmarkStart w:id="7" w:name="_Toc214449036"/>
+      <w:bookmarkStart w:id="7" w:name="_Toc215046695"/>
       <w:r>
         <w:t>5. Lenguajes de programación a utilizar (Tecnologías)</w:t>
       </w:r>
@@ -2798,11 +2812,13 @@
       <w:r>
         <w:rPr>
           <w:rStyle w:val="Textoennegrita"/>
+          <w:b w:val="0"/>
+          <w:bCs w:val="0"/>
         </w:rPr>
         <w:t>Java</w:t>
       </w:r>
       <w:r>
-        <w:t xml:space="preserve"> (Lenguaje robusto, maduro y ampliamente documentado para desarrollo Android).</w:t>
+        <w:t xml:space="preserve"> </w:t>
       </w:r>
     </w:p>
     <w:p>
@@ -2847,7 +2863,7 @@
       <w:pPr>
         <w:pStyle w:val="Ttulo1"/>
       </w:pPr>
-      <w:bookmarkStart w:id="8" w:name="_Toc214449037"/>
+      <w:bookmarkStart w:id="8" w:name="_Toc215046696"/>
       <w:r>
         <w:lastRenderedPageBreak/>
         <w:t>6. Diagrama de arquitectura</w:t>
@@ -2860,11 +2876,22 @@
           <w:rPr>
             <w:rStyle w:val="Hipervnculo"/>
           </w:rPr>
-          <w:t>https://lucid.app/lucidchart/4a661e78-fc1f-4156-b4ed-5aaa6c34db94/edit?viewport_loc=-15112%2C-4287%2C18488%2C10350%2C0_0&amp;invitationId=inv_28a234da-59ee-435f-86ea-a5a0a3d38dcf</w:t>
+          <w:t>https://lucid.app/lucidc</w:t>
+        </w:r>
+        <w:r>
+          <w:rPr>
+            <w:rStyle w:val="Hipervnculo"/>
+          </w:rPr>
+          <w:t>h</w:t>
+        </w:r>
+        <w:r>
+          <w:rPr>
+            <w:rStyle w:val="Hipervnculo"/>
+          </w:rPr>
+          <w:t>art/4a661e78-fc1f-4156-b4ed-5aaa6c34db94/edit?viewport_loc=-15112%2C-4287%2C18488%2C10350%2C0_0&amp;invitationId=inv_28a234da-59ee-435f-86ea-a5a0a3d38dcf</w:t>
         </w:r>
       </w:hyperlink>
     </w:p>
-    <w:p/>
     <w:p>
       <w:pPr>
         <w:rPr>
@@ -2972,7 +2999,7 @@
       <w:pPr>
         <w:pStyle w:val="Ttulo1"/>
       </w:pPr>
-      <w:bookmarkStart w:id="9" w:name="_Toc214449038"/>
+      <w:bookmarkStart w:id="9" w:name="_Toc215046697"/>
       <w:r>
         <w:t>7. Diagrama de clases</w:t>
       </w:r>
@@ -3070,7 +3097,7 @@
       <w:pPr>
         <w:pStyle w:val="Ttulo1"/>
       </w:pPr>
-      <w:bookmarkStart w:id="10" w:name="_Toc214449039"/>
+      <w:bookmarkStart w:id="10" w:name="_Toc215046698"/>
       <w:r>
         <w:lastRenderedPageBreak/>
         <w:t>8. Modelo entidad-relación</w:t>
@@ -3144,7 +3171,7 @@
       <w:pPr>
         <w:pStyle w:val="Ttulo1"/>
       </w:pPr>
-      <w:bookmarkStart w:id="11" w:name="_Toc214449040"/>
+      <w:bookmarkStart w:id="11" w:name="_Toc215046699"/>
       <w:r>
         <w:t>9. Entornos de aplicación del proyecto</w:t>
       </w:r>
@@ -3154,7 +3181,7 @@
       <w:pPr>
         <w:pStyle w:val="Ttulo2"/>
       </w:pPr>
-      <w:bookmarkStart w:id="12" w:name="_Toc214449041"/>
+      <w:bookmarkStart w:id="12" w:name="_Toc215046700"/>
       <w:r>
         <w:t>9.1 Software necesario</w:t>
       </w:r>
@@ -3171,7 +3198,19 @@
         <w:rPr>
           <w:lang w:eastAsia="es-ES_tradnl"/>
         </w:rPr>
-        <w:t>Para el desarrollo de esta arquitectura híbrida se requieren las siguientes herramientas:</w:t>
+        <w:t>Para el desarrollo de esta a</w:t>
+      </w:r>
+      <w:r>
+        <w:rPr>
+          <w:lang w:eastAsia="es-ES_tradnl"/>
+        </w:rPr>
+        <w:t xml:space="preserve">plicación </w:t>
+      </w:r>
+      <w:r>
+        <w:rPr>
+          <w:lang w:eastAsia="es-ES_tradnl"/>
+        </w:rPr>
+        <w:t>se requieren las siguientes herramientas:</w:t>
       </w:r>
     </w:p>
     <w:p>
@@ -3231,7 +3270,7 @@
         <w:rPr>
           <w:lang w:eastAsia="es-ES_tradnl"/>
         </w:rPr>
-        <w:t xml:space="preserve"> Editor de código ligero y potente, utilizado para el desarrollo de la aplicación web en Angular.</w:t>
+        <w:t xml:space="preserve"> Editor de código, utilizado para el desarrollo de la aplicación web en Angular.</w:t>
       </w:r>
     </w:p>
     <w:p>
@@ -3369,7 +3408,7 @@
       <w:pPr>
         <w:pStyle w:val="Ttulo2"/>
       </w:pPr>
-      <w:bookmarkStart w:id="13" w:name="_Toc214449042"/>
+      <w:bookmarkStart w:id="13" w:name="_Toc215046701"/>
       <w:r>
         <w:t>9.2 Hardware necesario</w:t>
       </w:r>
@@ -3436,7 +3475,41 @@
           <w:rFonts w:ascii="Arial" w:hAnsi="Arial" w:cs="Arial"/>
           <w:color w:val="1B1C1D"/>
         </w:rPr>
-        <w:t xml:space="preserve"> Android o iOS para pruebas físicas de la aplicación (</w:t>
+        <w:t xml:space="preserve"> Android para pruebas físicas de la aplicación</w:t>
+      </w:r>
+    </w:p>
+    <w:p>
+      <w:pPr>
+        <w:pStyle w:val="Ttulo1"/>
+      </w:pPr>
+      <w:bookmarkStart w:id="14" w:name="_Toc215046702"/>
+      <w:r>
+        <w:t>10. Prototipo de Interfaz de usuario</w:t>
+      </w:r>
+      <w:bookmarkEnd w:id="14"/>
+    </w:p>
+    <w:p>
+      <w:pPr>
+        <w:rPr>
+          <w:rFonts w:ascii="Arial" w:hAnsi="Arial" w:cs="Arial"/>
+          <w:color w:val="1B1C1D"/>
+        </w:rPr>
+      </w:pPr>
+      <w:r>
+        <w:rPr>
+          <w:rStyle w:val="Textoennegrita"/>
+          <w:rFonts w:ascii="Arial" w:hAnsi="Arial" w:cs="Arial"/>
+          <w:color w:val="1B1C1D"/>
+          <w:bdr w:val="none" w:sz="0" w:space="0" w:color="auto" w:frame="1"/>
+        </w:rPr>
+        <w:t>Home (Catálogo):</w:t>
+      </w:r>
+      <w:r>
+        <w:rPr>
+          <w:rFonts w:ascii="Arial" w:hAnsi="Arial" w:cs="Arial"/>
+          <w:color w:val="1B1C1D"/>
+        </w:rPr>
+        <w:t xml:space="preserve"> </w:t>
       </w:r>
       <w:proofErr w:type="spellStart"/>
       <w:r>
@@ -3444,7 +3517,7 @@
           <w:rFonts w:ascii="Arial" w:hAnsi="Arial" w:cs="Arial"/>
           <w:color w:val="1B1C1D"/>
         </w:rPr>
-        <w:t>debugging</w:t>
+        <w:t>Grid</w:t>
       </w:r>
       <w:proofErr w:type="spellEnd"/>
       <w:r>
@@ -3452,220 +3525,58 @@
           <w:rFonts w:ascii="Arial" w:hAnsi="Arial" w:cs="Arial"/>
           <w:color w:val="1B1C1D"/>
         </w:rPr>
-        <w:t xml:space="preserve"> USB).</w:t>
-      </w:r>
-    </w:p>
-    <w:p>
-      <w:pPr>
-        <w:pStyle w:val="Ttulo1"/>
-      </w:pPr>
-      <w:bookmarkStart w:id="14" w:name="_Toc214449043"/>
-      <w:r>
-        <w:t>10. Prototipo de Interfaz de usuario</w:t>
-      </w:r>
-      <w:bookmarkEnd w:id="14"/>
-    </w:p>
-    <w:p>
-      <w:pPr>
-        <w:rPr>
-          <w:rFonts w:ascii="Arial" w:hAnsi="Arial" w:cs="Arial"/>
-          <w:color w:val="1B1C1D"/>
-        </w:rPr>
-      </w:pPr>
-      <w:r>
-        <w:rPr>
-          <w:rStyle w:val="nfasis"/>
+        <w:t xml:space="preserve"> de imágenes de zapatillas con precio y nombre. Barra de búsqueda superior.</w:t>
+      </w:r>
+    </w:p>
+    <w:p>
+      <w:pPr>
+        <w:rPr>
+          <w:rFonts w:ascii="Arial" w:hAnsi="Arial" w:cs="Arial"/>
+          <w:color w:val="1B1C1D"/>
+        </w:rPr>
+      </w:pPr>
+      <w:r>
+        <w:rPr>
+          <w:rStyle w:val="Textoennegrita"/>
           <w:rFonts w:ascii="Arial" w:hAnsi="Arial" w:cs="Arial"/>
           <w:color w:val="1B1C1D"/>
           <w:bdr w:val="none" w:sz="0" w:space="0" w:color="auto" w:frame="1"/>
         </w:rPr>
-        <w:t xml:space="preserve">(En este apartado deberás insertar capturas hechas con </w:t>
+        <w:t>Detalle de Producto:</w:t>
+      </w:r>
+      <w:r>
+        <w:rPr>
+          <w:rFonts w:ascii="Arial" w:hAnsi="Arial" w:cs="Arial"/>
+          <w:color w:val="1B1C1D"/>
+        </w:rPr>
+        <w:t xml:space="preserve"> Foto grande de la zapatilla, selector de talla, descripción y botón "Añadir al carrito".</w:t>
+      </w:r>
+    </w:p>
+    <w:p>
+      <w:pPr>
+        <w:rPr>
+          <w:rFonts w:ascii="Arial" w:hAnsi="Arial" w:cs="Arial"/>
+          <w:color w:val="1B1C1D"/>
+        </w:rPr>
+      </w:pPr>
+      <w:r>
+        <w:rPr>
+          <w:rStyle w:val="Textoennegrita"/>
+          <w:rFonts w:ascii="Arial" w:hAnsi="Arial" w:cs="Arial"/>
+          <w:color w:val="1B1C1D"/>
+          <w:bdr w:val="none" w:sz="0" w:space="0" w:color="auto" w:frame="1"/>
+        </w:rPr>
+        <w:t>Panel Adm</w:t>
       </w:r>
       <w:proofErr w:type="spellStart"/>
       <w:r>
         <w:rPr>
-          <w:rStyle w:val="nfasis"/>
+          <w:rStyle w:val="Textoennegrita"/>
           <w:rFonts w:ascii="Arial" w:hAnsi="Arial" w:cs="Arial"/>
           <w:color w:val="1B1C1D"/>
           <w:bdr w:val="none" w:sz="0" w:space="0" w:color="auto" w:frame="1"/>
         </w:rPr>
-        <w:t>Figma</w:t>
-      </w:r>
-      <w:proofErr w:type="spellEnd"/>
-      <w:r>
-        <w:rPr>
-          <w:rStyle w:val="nfasis"/>
-          <w:rFonts w:ascii="Arial" w:hAnsi="Arial" w:cs="Arial"/>
-          <w:color w:val="1B1C1D"/>
-          <w:bdr w:val="none" w:sz="0" w:space="0" w:color="auto" w:frame="1"/>
-        </w:rPr>
-        <w:t xml:space="preserve"> o dibujos a mano alzada. Se sugieren las siguientes pantallas):</w:t>
-      </w:r>
-    </w:p>
-    <w:p>
-      <w:pPr>
-        <w:rPr>
-          <w:rFonts w:ascii="Arial" w:hAnsi="Arial" w:cs="Arial"/>
-          <w:color w:val="1B1C1D"/>
-        </w:rPr>
-      </w:pPr>
-      <w:proofErr w:type="spellStart"/>
-      <w:r>
-        <w:rPr>
-          <w:rStyle w:val="Textoennegrita"/>
-          <w:rFonts w:ascii="Arial" w:hAnsi="Arial" w:cs="Arial"/>
-          <w:color w:val="1B1C1D"/>
-          <w:bdr w:val="none" w:sz="0" w:space="0" w:color="auto" w:frame="1"/>
-        </w:rPr>
-        <w:t>Login</w:t>
-      </w:r>
-      <w:proofErr w:type="spellEnd"/>
-      <w:r>
-        <w:rPr>
-          <w:rStyle w:val="Textoennegrita"/>
-          <w:rFonts w:ascii="Arial" w:hAnsi="Arial" w:cs="Arial"/>
-          <w:color w:val="1B1C1D"/>
-          <w:bdr w:val="none" w:sz="0" w:space="0" w:color="auto" w:frame="1"/>
-        </w:rPr>
-        <w:t>/Registro:</w:t>
-      </w:r>
-      <w:r>
-        <w:rPr>
-          <w:rFonts w:ascii="Arial" w:hAnsi="Arial" w:cs="Arial"/>
-          <w:color w:val="1B1C1D"/>
-        </w:rPr>
-        <w:t xml:space="preserve"> Pantalla limpia con campos para email/usuario y contraseña.</w:t>
-      </w:r>
-    </w:p>
-    <w:p>
-      <w:pPr>
-        <w:rPr>
-          <w:rFonts w:ascii="Arial" w:hAnsi="Arial" w:cs="Arial"/>
-          <w:color w:val="1B1C1D"/>
-        </w:rPr>
-      </w:pPr>
-      <w:r>
-        <w:rPr>
-          <w:rStyle w:val="Textoennegrita"/>
-          <w:rFonts w:ascii="Arial" w:hAnsi="Arial" w:cs="Arial"/>
-          <w:color w:val="1B1C1D"/>
-          <w:bdr w:val="none" w:sz="0" w:space="0" w:color="auto" w:frame="1"/>
-        </w:rPr>
-        <w:t>Home (Catálogo):</w:t>
-      </w:r>
-      <w:r>
-        <w:rPr>
-          <w:rFonts w:ascii="Arial" w:hAnsi="Arial" w:cs="Arial"/>
-          <w:color w:val="1B1C1D"/>
-        </w:rPr>
-        <w:t xml:space="preserve"> </w:t>
-      </w:r>
-      <w:proofErr w:type="spellStart"/>
-      <w:r>
-        <w:rPr>
-          <w:rFonts w:ascii="Arial" w:hAnsi="Arial" w:cs="Arial"/>
-          <w:color w:val="1B1C1D"/>
-        </w:rPr>
-        <w:t>Grid</w:t>
-      </w:r>
-      <w:proofErr w:type="spellEnd"/>
-      <w:r>
-        <w:rPr>
-          <w:rFonts w:ascii="Arial" w:hAnsi="Arial" w:cs="Arial"/>
-          <w:color w:val="1B1C1D"/>
-        </w:rPr>
-        <w:t xml:space="preserve"> de imágenes de zapatillas con precio y nombre. Barra de búsqueda superior.</w:t>
-      </w:r>
-    </w:p>
-    <w:p>
-      <w:pPr>
-        <w:rPr>
-          <w:rFonts w:ascii="Arial" w:hAnsi="Arial" w:cs="Arial"/>
-          <w:color w:val="1B1C1D"/>
-        </w:rPr>
-      </w:pPr>
-      <w:r>
-        <w:rPr>
-          <w:rStyle w:val="Textoennegrita"/>
-          <w:rFonts w:ascii="Arial" w:hAnsi="Arial" w:cs="Arial"/>
-          <w:color w:val="1B1C1D"/>
-          <w:bdr w:val="none" w:sz="0" w:space="0" w:color="auto" w:frame="1"/>
-        </w:rPr>
-        <w:t>Detalle de Producto:</w:t>
-      </w:r>
-      <w:r>
-        <w:rPr>
-          <w:rFonts w:ascii="Arial" w:hAnsi="Arial" w:cs="Arial"/>
-          <w:color w:val="1B1C1D"/>
-        </w:rPr>
-        <w:t xml:space="preserve"> Foto grande de la zapatilla, selector de talla, descripción y botón "Añadir al carrito".</w:t>
-      </w:r>
-    </w:p>
-    <w:p>
-      <w:pPr>
-        <w:rPr>
-          <w:rFonts w:ascii="Arial" w:hAnsi="Arial" w:cs="Arial"/>
-          <w:color w:val="1B1C1D"/>
-        </w:rPr>
-      </w:pPr>
-      <w:r>
-        <w:rPr>
-          <w:rStyle w:val="Textoennegrita"/>
-          <w:rFonts w:ascii="Arial" w:hAnsi="Arial" w:cs="Arial"/>
-          <w:color w:val="1B1C1D"/>
-          <w:bdr w:val="none" w:sz="0" w:space="0" w:color="auto" w:frame="1"/>
-        </w:rPr>
-        <w:t>Carrito:</w:t>
-      </w:r>
-      <w:r>
-        <w:rPr>
-          <w:rFonts w:ascii="Arial" w:hAnsi="Arial" w:cs="Arial"/>
-          <w:color w:val="1B1C1D"/>
-        </w:rPr>
-        <w:t xml:space="preserve"> Lista de </w:t>
-      </w:r>
-      <w:proofErr w:type="spellStart"/>
-      <w:r>
-        <w:rPr>
-          <w:rFonts w:ascii="Arial" w:hAnsi="Arial" w:cs="Arial"/>
-          <w:color w:val="1B1C1D"/>
-        </w:rPr>
-        <w:t>items</w:t>
-      </w:r>
-      <w:proofErr w:type="spellEnd"/>
-      <w:r>
-        <w:rPr>
-          <w:rFonts w:ascii="Arial" w:hAnsi="Arial" w:cs="Arial"/>
-          <w:color w:val="1B1C1D"/>
-        </w:rPr>
-        <w:t xml:space="preserve"> seleccionados con subtotal y botón "Pagar".</w:t>
-      </w:r>
-    </w:p>
-    <w:p>
-      <w:pPr>
-        <w:rPr>
-          <w:rFonts w:ascii="Arial" w:hAnsi="Arial" w:cs="Arial"/>
-          <w:color w:val="1B1C1D"/>
-        </w:rPr>
-      </w:pPr>
-      <w:r>
-        <w:rPr>
-          <w:rStyle w:val="Textoennegrita"/>
-          <w:rFonts w:ascii="Arial" w:hAnsi="Arial" w:cs="Arial"/>
-          <w:color w:val="1B1C1D"/>
-          <w:bdr w:val="none" w:sz="0" w:space="0" w:color="auto" w:frame="1"/>
-        </w:rPr>
-        <w:t xml:space="preserve">Panel </w:t>
-      </w:r>
-      <w:proofErr w:type="spellStart"/>
-      <w:r>
-        <w:rPr>
-          <w:rStyle w:val="Textoennegrita"/>
-          <w:rFonts w:ascii="Arial" w:hAnsi="Arial" w:cs="Arial"/>
-          <w:color w:val="1B1C1D"/>
-          <w:bdr w:val="none" w:sz="0" w:space="0" w:color="auto" w:frame="1"/>
-        </w:rPr>
-        <w:t>Admin</w:t>
+        <w:t>in</w:t>
       </w:r>
       <w:proofErr w:type="spellEnd"/>
       <w:r>
@@ -8090,6 +8001,18 @@
       <w:shd w:val="clear" w:color="auto" w:fill="E1DFDD"/>
     </w:rPr>
   </w:style>
+  <w:style w:type="character" w:styleId="Hipervnculovisitado">
+    <w:name w:val="FollowedHyperlink"/>
+    <w:basedOn w:val="Fuentedeprrafopredeter"/>
+    <w:uiPriority w:val="99"/>
+    <w:semiHidden/>
+    <w:unhideWhenUsed/>
+    <w:rsid w:val="00785C9B"/>
+    <w:rPr>
+      <w:color w:val="954F72" w:themeColor="followedHyperlink"/>
+      <w:u w:val="single"/>
+    </w:rPr>
+  </w:style>
 </w:styles>
 </file>
 

</xml_diff>

<commit_message>
Add concurrent file character counting with threads
Introduces Conteo.java to perform file character counting in separate threads. Refactors Ficheros.java to use Conteo threads for concurrent processing and measures execution time. Adds .gitignore and supporting documentation files.
</commit_message>
<xml_diff>
--- a/Proyecto/AnteProyecto_MSB.docx
+++ b/Proyecto/AnteProyecto_MSB.docx
@@ -8,7 +8,7 @@
           <w:noProof/>
         </w:rPr>
         <w:drawing>
-          <wp:anchor distT="0" distB="0" distL="114300" distR="114300" simplePos="0" relativeHeight="251659264" behindDoc="1" locked="0" layoutInCell="1" allowOverlap="1" wp14:anchorId="7AAEA8D2" wp14:editId="198F8C2F">
+          <wp:anchor distT="0" distB="0" distL="114300" distR="114300" simplePos="0" relativeHeight="251659264" behindDoc="1" locked="0" layoutInCell="1" allowOverlap="1" wp14:anchorId="5D9D4A0E" wp14:editId="41918C19">
             <wp:simplePos x="0" y="0"/>
             <wp:positionH relativeFrom="column">
               <wp:posOffset>-496570</wp:posOffset>
@@ -72,7 +72,7 @@
         <mc:AlternateContent>
           <mc:Choice Requires="wps">
             <w:drawing>
-              <wp:anchor distT="0" distB="0" distL="114300" distR="114300" simplePos="0" relativeHeight="251660288" behindDoc="0" locked="0" layoutInCell="1" allowOverlap="1" wp14:anchorId="33019F59" wp14:editId="604ADC9E">
+              <wp:anchor distT="0" distB="0" distL="114300" distR="114300" simplePos="0" relativeHeight="251660288" behindDoc="0" locked="0" layoutInCell="1" allowOverlap="1" wp14:anchorId="01A20C1F" wp14:editId="40B7B76F">
                 <wp:simplePos x="0" y="0"/>
                 <wp:positionH relativeFrom="column">
                   <wp:posOffset>-661135</wp:posOffset>
@@ -161,11 +161,11 @@
           </mc:Choice>
           <mc:Fallback>
             <w:pict>
-              <v:shapetype w14:anchorId="33019F59" id="_x0000_t202" coordsize="21600,21600" o:spt="202" path="m,l,21600r21600,l21600,xe">
+              <v:shapetype w14:anchorId="01A20C1F" id="_x0000_t202" coordsize="21600,21600" o:spt="202" path="m,l,21600r21600,l21600,xe">
                 <v:stroke joinstyle="miter"/>
                 <v:path gradientshapeok="t" o:connecttype="rect"/>
               </v:shapetype>
-              <v:shape id="Text Box 3" o:spid="_x0000_s1026" type="#_x0000_t202" style="position:absolute;left:0;text-align:left;margin-left:-52.05pt;margin-top:314.8pt;width:352.6pt;height:180pt;z-index:251660288;visibility:visible;mso-wrap-style:square;mso-width-percent:0;mso-height-percent:0;mso-wrap-distance-left:9pt;mso-wrap-distance-top:0;mso-wrap-distance-right:9pt;mso-wrap-distance-bottom:0;mso-position-horizontal:absolute;mso-position-horizontal-relative:text;mso-position-vertical:absolute;mso-position-vertical-relative:text;mso-width-percent:0;mso-height-percent:0;mso-width-relative:margin;mso-height-relative:margin;v-text-anchor:top" o:gfxdata="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" filled="f" stroked="f" strokeweight=".5pt">
+              <v:shape id="Text Box 3" o:spid="_x0000_s1026" type="#_x0000_t202" style="position:absolute;left:0;text-align:left;margin-left:-52.05pt;margin-top:314.8pt;width:352.6pt;height:180pt;z-index:251660288;visibility:visible;mso-wrap-style:square;mso-width-percent:0;mso-height-percent:0;mso-wrap-distance-left:9pt;mso-wrap-distance-top:0;mso-wrap-distance-right:9pt;mso-wrap-distance-bottom:0;mso-position-horizontal:absolute;mso-position-horizontal-relative:text;mso-position-vertical:absolute;mso-position-vertical-relative:text;mso-width-percent:0;mso-height-percent:0;mso-width-relative:margin;mso-height-relative:margin;v-text-anchor:top" o:gfxdata="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" filled="f" stroked="f" strokeweight=".5pt">
                 <v:textbox>
                   <w:txbxContent>
                     <w:p>
@@ -220,7 +220,7 @@
         <mc:AlternateContent>
           <mc:Choice Requires="wps">
             <w:drawing>
-              <wp:anchor distT="0" distB="0" distL="114300" distR="114300" simplePos="0" relativeHeight="251663360" behindDoc="1" locked="0" layoutInCell="1" allowOverlap="1" wp14:anchorId="32FE7796" wp14:editId="673E7554">
+              <wp:anchor distT="0" distB="0" distL="114300" distR="114300" simplePos="0" relativeHeight="251663360" behindDoc="1" locked="0" layoutInCell="1" allowOverlap="1" wp14:anchorId="630503AD" wp14:editId="526AEDCC">
                 <wp:simplePos x="0" y="0"/>
                 <wp:positionH relativeFrom="column">
                   <wp:posOffset>-1194435</wp:posOffset>
@@ -302,7 +302,7 @@
                   <v:h position="#0,topLeft" xrange="0,21600"/>
                 </v:handles>
               </v:shapetype>
-              <v:shape id="Isosceles Triangle 5" o:spid="_x0000_s1026" type="#_x0000_t5" style="position:absolute;margin-left:-94.05pt;margin-top:674.65pt;width:115.9pt;height:99.9pt;z-index:-251653120;visibility:visible;mso-wrap-style:square;mso-width-percent:0;mso-height-percent:0;mso-wrap-distance-left:9pt;mso-wrap-distance-top:0;mso-wrap-distance-right:9pt;mso-wrap-distance-bottom:0;mso-position-horizontal:absolute;mso-position-horizontal-relative:text;mso-position-vertical:absolute;mso-position-vertical-relative:text;mso-width-percent:0;mso-height-percent:0;mso-width-relative:margin;mso-height-relative:margin;v-text-anchor:middle" o:gfxdata="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" adj="0" fillcolor="#00c" stroked="f" strokeweight="1pt"/>
+              <v:shape id="Isosceles Triangle 5" o:spid="_x0000_s1026" type="#_x0000_t5" style="position:absolute;margin-left:-94.05pt;margin-top:674.65pt;width:115.9pt;height:99.9pt;z-index:-251653120;visibility:visible;mso-wrap-style:square;mso-width-percent:0;mso-height-percent:0;mso-wrap-distance-left:9pt;mso-wrap-distance-top:0;mso-wrap-distance-right:9pt;mso-wrap-distance-bottom:0;mso-position-horizontal:absolute;mso-position-horizontal-relative:text;mso-position-vertical:absolute;mso-position-vertical-relative:text;mso-width-percent:0;mso-height-percent:0;mso-width-relative:margin;mso-height-relative:margin;v-text-anchor:middle" o:gfxdata="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" adj="0" fillcolor="#00c" stroked="f" strokeweight="1pt"/>
             </w:pict>
           </mc:Fallback>
         </mc:AlternateContent>
@@ -314,7 +314,7 @@
         <mc:AlternateContent>
           <mc:Choice Requires="wps">
             <w:drawing>
-              <wp:anchor distT="0" distB="0" distL="114300" distR="114300" simplePos="0" relativeHeight="251662336" behindDoc="0" locked="0" layoutInCell="1" allowOverlap="1" wp14:anchorId="62280E6D" wp14:editId="35BE4F8E">
+              <wp:anchor distT="0" distB="0" distL="114300" distR="114300" simplePos="0" relativeHeight="251662336" behindDoc="0" locked="0" layoutInCell="1" allowOverlap="1" wp14:anchorId="6B317ECD" wp14:editId="64DA7A8D">
                 <wp:simplePos x="0" y="0"/>
                 <wp:positionH relativeFrom="column">
                   <wp:posOffset>-492760</wp:posOffset>
@@ -404,7 +404,7 @@
                   <v:h position="#0,topLeft" xrange="0,21600"/>
                 </v:handles>
               </v:shapetype>
-              <v:shape id="Parallelogram 4" o:spid="_x0000_s1026" type="#_x0000_t7" style="position:absolute;margin-left:-38.8pt;margin-top:611.35pt;width:286.35pt;height:7.5pt;z-index:251662336;visibility:visible;mso-wrap-style:square;mso-width-percent:0;mso-height-percent:0;mso-wrap-distance-left:9pt;mso-wrap-distance-top:0;mso-wrap-distance-right:9pt;mso-wrap-distance-bottom:0;mso-position-horizontal:absolute;mso-position-horizontal-relative:text;mso-position-vertical:absolute;mso-position-vertical-relative:text;mso-width-percent:0;mso-height-percent:0;mso-width-relative:margin;mso-height-relative:margin;v-text-anchor:middle" o:gfxdata="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" adj="141" fillcolor="#0b1023" stroked="f" strokeweight="1pt"/>
+              <v:shape id="Parallelogram 4" o:spid="_x0000_s1026" type="#_x0000_t7" style="position:absolute;margin-left:-38.8pt;margin-top:611.35pt;width:286.35pt;height:7.5pt;z-index:251662336;visibility:visible;mso-wrap-style:square;mso-width-percent:0;mso-height-percent:0;mso-wrap-distance-left:9pt;mso-wrap-distance-top:0;mso-wrap-distance-right:9pt;mso-wrap-distance-bottom:0;mso-position-horizontal:absolute;mso-position-horizontal-relative:text;mso-position-vertical:absolute;mso-position-vertical-relative:text;mso-width-percent:0;mso-height-percent:0;mso-width-relative:margin;mso-height-relative:margin;v-text-anchor:middle" o:gfxdata="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" adj="141" fillcolor="#0b1023" stroked="f" strokeweight="1pt"/>
             </w:pict>
           </mc:Fallback>
         </mc:AlternateContent>
@@ -416,7 +416,7 @@
         <mc:AlternateContent>
           <mc:Choice Requires="wps">
             <w:drawing>
-              <wp:anchor distT="0" distB="0" distL="114300" distR="114300" simplePos="0" relativeHeight="251661312" behindDoc="0" locked="0" layoutInCell="1" allowOverlap="1" wp14:anchorId="60FEB9E6" wp14:editId="272E990D">
+              <wp:anchor distT="0" distB="0" distL="114300" distR="114300" simplePos="0" relativeHeight="251661312" behindDoc="0" locked="0" layoutInCell="1" allowOverlap="1" wp14:anchorId="2C9C6BA2" wp14:editId="07D9FBB9">
                 <wp:simplePos x="0" y="0"/>
                 <wp:positionH relativeFrom="column">
                   <wp:posOffset>-496570</wp:posOffset>
@@ -551,7 +551,7 @@
           </mc:Choice>
           <mc:Fallback>
             <w:pict>
-              <v:shape w14:anchorId="60FEB9E6" id="_x0000_s1027" type="#_x0000_t202" style="position:absolute;left:0;text-align:left;margin-left:-39.1pt;margin-top:494.95pt;width:299.15pt;height:98.05pt;z-index:251661312;visibility:visible;mso-wrap-style:square;mso-width-percent:0;mso-height-percent:0;mso-wrap-distance-left:9pt;mso-wrap-distance-top:0;mso-wrap-distance-right:9pt;mso-wrap-distance-bottom:0;mso-position-horizontal:absolute;mso-position-horizontal-relative:text;mso-position-vertical:absolute;mso-position-vertical-relative:text;mso-width-percent:0;mso-height-percent:0;mso-width-relative:margin;mso-height-relative:margin;v-text-anchor:top" o:gfxdata="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" filled="f" stroked="f" strokeweight=".5pt">
+              <v:shape w14:anchorId="2C9C6BA2" id="_x0000_s1027" type="#_x0000_t202" style="position:absolute;left:0;text-align:left;margin-left:-39.1pt;margin-top:494.95pt;width:299.15pt;height:98.05pt;z-index:251661312;visibility:visible;mso-wrap-style:square;mso-width-percent:0;mso-height-percent:0;mso-wrap-distance-left:9pt;mso-wrap-distance-top:0;mso-wrap-distance-right:9pt;mso-wrap-distance-bottom:0;mso-position-horizontal:absolute;mso-position-horizontal-relative:text;mso-position-vertical:absolute;mso-position-vertical-relative:text;mso-width-percent:0;mso-height-percent:0;mso-width-relative:margin;mso-height-relative:margin;v-text-anchor:top" o:gfxdata="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" filled="f" stroked="f" strokeweight=".5pt">
                 <v:textbox>
                   <w:txbxContent>
                     <w:p>
@@ -674,7 +674,7 @@
               <w:noProof/>
               <w:kern w:val="2"/>
               <w:szCs w:val="24"/>
-              <w:lang w:eastAsia="es-ES_tradnl"/>
+              <w:lang w:eastAsia="es-ES"/>
             </w:rPr>
           </w:pPr>
           <w:r>
@@ -686,7 +686,7 @@
           <w:r>
             <w:fldChar w:fldCharType="separate"/>
           </w:r>
-          <w:hyperlink w:anchor="_Toc215046688" w:history="1">
+          <w:hyperlink w:anchor="_Toc215418848" w:history="1">
             <w:r>
               <w:rPr>
                 <w:rStyle w:val="Hipervnculo"/>
@@ -713,7 +713,7 @@
                 <w:noProof/>
                 <w:webHidden/>
               </w:rPr>
-              <w:instrText xml:space="preserve"> PAGEREF _Toc215046688 \h </w:instrText>
+              <w:instrText xml:space="preserve"> PAGEREF _Toc215418848 \h </w:instrText>
             </w:r>
             <w:r>
               <w:rPr>
@@ -755,10 +755,10 @@
               <w:noProof/>
               <w:kern w:val="2"/>
               <w:szCs w:val="24"/>
-              <w:lang w:eastAsia="es-ES_tradnl"/>
+              <w:lang w:eastAsia="es-ES"/>
             </w:rPr>
           </w:pPr>
-          <w:hyperlink w:anchor="_Toc215046689" w:history="1">
+          <w:hyperlink w:anchor="_Toc215418849" w:history="1">
             <w:r>
               <w:rPr>
                 <w:rStyle w:val="Hipervnculo"/>
@@ -785,7 +785,7 @@
                 <w:noProof/>
                 <w:webHidden/>
               </w:rPr>
-              <w:instrText xml:space="preserve"> PAGEREF _Toc215046689 \h </w:instrText>
+              <w:instrText xml:space="preserve"> PAGEREF _Toc215418849 \h </w:instrText>
             </w:r>
             <w:r>
               <w:rPr>
@@ -827,10 +827,10 @@
               <w:noProof/>
               <w:kern w:val="2"/>
               <w:szCs w:val="24"/>
-              <w:lang w:eastAsia="es-ES_tradnl"/>
+              <w:lang w:eastAsia="es-ES"/>
             </w:rPr>
           </w:pPr>
-          <w:hyperlink w:anchor="_Toc215046690" w:history="1">
+          <w:hyperlink w:anchor="_Toc215418850" w:history="1">
             <w:r>
               <w:rPr>
                 <w:rStyle w:val="Hipervnculo"/>
@@ -857,7 +857,7 @@
                 <w:noProof/>
                 <w:webHidden/>
               </w:rPr>
-              <w:instrText xml:space="preserve"> PAGEREF _Toc215046690 \h </w:instrText>
+              <w:instrText xml:space="preserve"> PAGEREF _Toc215418850 \h </w:instrText>
             </w:r>
             <w:r>
               <w:rPr>
@@ -899,10 +899,10 @@
               <w:noProof/>
               <w:kern w:val="2"/>
               <w:szCs w:val="24"/>
-              <w:lang w:eastAsia="es-ES_tradnl"/>
+              <w:lang w:eastAsia="es-ES"/>
             </w:rPr>
           </w:pPr>
-          <w:hyperlink w:anchor="_Toc215046691" w:history="1">
+          <w:hyperlink w:anchor="_Toc215418851" w:history="1">
             <w:r>
               <w:rPr>
                 <w:rStyle w:val="Hipervnculo"/>
@@ -929,7 +929,7 @@
                 <w:noProof/>
                 <w:webHidden/>
               </w:rPr>
-              <w:instrText xml:space="preserve"> PAGEREF _Toc215046691 \h </w:instrText>
+              <w:instrText xml:space="preserve"> PAGEREF _Toc215418851 \h </w:instrText>
             </w:r>
             <w:r>
               <w:rPr>
@@ -971,10 +971,10 @@
               <w:noProof/>
               <w:kern w:val="2"/>
               <w:szCs w:val="24"/>
-              <w:lang w:eastAsia="es-ES_tradnl"/>
+              <w:lang w:eastAsia="es-ES"/>
             </w:rPr>
           </w:pPr>
-          <w:hyperlink w:anchor="_Toc215046692" w:history="1">
+          <w:hyperlink w:anchor="_Toc215418852" w:history="1">
             <w:r>
               <w:rPr>
                 <w:rStyle w:val="Hipervnculo"/>
@@ -1001,7 +1001,7 @@
                 <w:noProof/>
                 <w:webHidden/>
               </w:rPr>
-              <w:instrText xml:space="preserve"> PAGEREF _Toc215046692 \h </w:instrText>
+              <w:instrText xml:space="preserve"> PAGEREF _Toc215418852 \h </w:instrText>
             </w:r>
             <w:r>
               <w:rPr>
@@ -1043,10 +1043,10 @@
               <w:noProof/>
               <w:kern w:val="2"/>
               <w:szCs w:val="24"/>
-              <w:lang w:eastAsia="es-ES_tradnl"/>
+              <w:lang w:eastAsia="es-ES"/>
             </w:rPr>
           </w:pPr>
-          <w:hyperlink w:anchor="_Toc215046693" w:history="1">
+          <w:hyperlink w:anchor="_Toc215418853" w:history="1">
             <w:r>
               <w:rPr>
                 <w:rStyle w:val="Hipervnculo"/>
@@ -1073,7 +1073,7 @@
                 <w:noProof/>
                 <w:webHidden/>
               </w:rPr>
-              <w:instrText xml:space="preserve"> PAGEREF _Toc215046693 \h </w:instrText>
+              <w:instrText xml:space="preserve"> PAGEREF _Toc215418853 \h </w:instrText>
             </w:r>
             <w:r>
               <w:rPr>
@@ -1115,10 +1115,10 @@
               <w:noProof/>
               <w:kern w:val="2"/>
               <w:szCs w:val="24"/>
-              <w:lang w:eastAsia="es-ES_tradnl"/>
+              <w:lang w:eastAsia="es-ES"/>
             </w:rPr>
           </w:pPr>
-          <w:hyperlink w:anchor="_Toc215046694" w:history="1">
+          <w:hyperlink w:anchor="_Toc215418854" w:history="1">
             <w:r>
               <w:rPr>
                 <w:rStyle w:val="Hipervnculo"/>
@@ -1145,7 +1145,7 @@
                 <w:noProof/>
                 <w:webHidden/>
               </w:rPr>
-              <w:instrText xml:space="preserve"> PAGEREF _Toc215046694 \h </w:instrText>
+              <w:instrText xml:space="preserve"> PAGEREF _Toc215418854 \h </w:instrText>
             </w:r>
             <w:r>
               <w:rPr>
@@ -1187,10 +1187,10 @@
               <w:noProof/>
               <w:kern w:val="2"/>
               <w:szCs w:val="24"/>
-              <w:lang w:eastAsia="es-ES_tradnl"/>
+              <w:lang w:eastAsia="es-ES"/>
             </w:rPr>
           </w:pPr>
-          <w:hyperlink w:anchor="_Toc215046695" w:history="1">
+          <w:hyperlink w:anchor="_Toc215418855" w:history="1">
             <w:r>
               <w:rPr>
                 <w:rStyle w:val="Hipervnculo"/>
@@ -1217,7 +1217,7 @@
                 <w:noProof/>
                 <w:webHidden/>
               </w:rPr>
-              <w:instrText xml:space="preserve"> PAGEREF _Toc215046695 \h </w:instrText>
+              <w:instrText xml:space="preserve"> PAGEREF _Toc215418855 \h </w:instrText>
             </w:r>
             <w:r>
               <w:rPr>
@@ -1259,10 +1259,10 @@
               <w:noProof/>
               <w:kern w:val="2"/>
               <w:szCs w:val="24"/>
-              <w:lang w:eastAsia="es-ES_tradnl"/>
+              <w:lang w:eastAsia="es-ES"/>
             </w:rPr>
           </w:pPr>
-          <w:hyperlink w:anchor="_Toc215046696" w:history="1">
+          <w:hyperlink w:anchor="_Toc215418856" w:history="1">
             <w:r>
               <w:rPr>
                 <w:rStyle w:val="Hipervnculo"/>
@@ -1289,7 +1289,7 @@
                 <w:noProof/>
                 <w:webHidden/>
               </w:rPr>
-              <w:instrText xml:space="preserve"> PAGEREF _Toc215046696 \h </w:instrText>
+              <w:instrText xml:space="preserve"> PAGEREF _Toc215418856 \h </w:instrText>
             </w:r>
             <w:r>
               <w:rPr>
@@ -1309,7 +1309,7 @@
                 <w:noProof/>
                 <w:webHidden/>
               </w:rPr>
-              <w:t>6</w:t>
+              <w:t>5</w:t>
             </w:r>
             <w:r>
               <w:rPr>
@@ -1331,10 +1331,10 @@
               <w:noProof/>
               <w:kern w:val="2"/>
               <w:szCs w:val="24"/>
-              <w:lang w:eastAsia="es-ES_tradnl"/>
+              <w:lang w:eastAsia="es-ES"/>
             </w:rPr>
           </w:pPr>
-          <w:hyperlink w:anchor="_Toc215046697" w:history="1">
+          <w:hyperlink w:anchor="_Toc215418857" w:history="1">
             <w:r>
               <w:rPr>
                 <w:rStyle w:val="Hipervnculo"/>
@@ -1361,7 +1361,7 @@
                 <w:noProof/>
                 <w:webHidden/>
               </w:rPr>
-              <w:instrText xml:space="preserve"> PAGEREF _Toc215046697 \h </w:instrText>
+              <w:instrText xml:space="preserve"> PAGEREF _Toc215418857 \h </w:instrText>
             </w:r>
             <w:r>
               <w:rPr>
@@ -1403,10 +1403,10 @@
               <w:noProof/>
               <w:kern w:val="2"/>
               <w:szCs w:val="24"/>
-              <w:lang w:eastAsia="es-ES_tradnl"/>
+              <w:lang w:eastAsia="es-ES"/>
             </w:rPr>
           </w:pPr>
-          <w:hyperlink w:anchor="_Toc215046698" w:history="1">
+          <w:hyperlink w:anchor="_Toc215418858" w:history="1">
             <w:r>
               <w:rPr>
                 <w:rStyle w:val="Hipervnculo"/>
@@ -1433,7 +1433,7 @@
                 <w:noProof/>
                 <w:webHidden/>
               </w:rPr>
-              <w:instrText xml:space="preserve"> PAGEREF _Toc215046698 \h </w:instrText>
+              <w:instrText xml:space="preserve"> PAGEREF _Toc215418858 \h </w:instrText>
             </w:r>
             <w:r>
               <w:rPr>
@@ -1453,7 +1453,7 @@
                 <w:noProof/>
                 <w:webHidden/>
               </w:rPr>
-              <w:t>8</w:t>
+              <w:t>7</w:t>
             </w:r>
             <w:r>
               <w:rPr>
@@ -1475,10 +1475,10 @@
               <w:noProof/>
               <w:kern w:val="2"/>
               <w:szCs w:val="24"/>
-              <w:lang w:eastAsia="es-ES_tradnl"/>
+              <w:lang w:eastAsia="es-ES"/>
             </w:rPr>
           </w:pPr>
-          <w:hyperlink w:anchor="_Toc215046699" w:history="1">
+          <w:hyperlink w:anchor="_Toc215418859" w:history="1">
             <w:r>
               <w:rPr>
                 <w:rStyle w:val="Hipervnculo"/>
@@ -1505,7 +1505,7 @@
                 <w:noProof/>
                 <w:webHidden/>
               </w:rPr>
-              <w:instrText xml:space="preserve"> PAGEREF _Toc215046699 \h </w:instrText>
+              <w:instrText xml:space="preserve"> PAGEREF _Toc215418859 \h </w:instrText>
             </w:r>
             <w:r>
               <w:rPr>
@@ -1525,7 +1525,7 @@
                 <w:noProof/>
                 <w:webHidden/>
               </w:rPr>
-              <w:t>8</w:t>
+              <w:t>7</w:t>
             </w:r>
             <w:r>
               <w:rPr>
@@ -1547,30 +1547,16 @@
               <w:noProof/>
               <w:kern w:val="2"/>
               <w:szCs w:val="24"/>
-              <w:lang w:eastAsia="es-ES_tradnl"/>
+              <w:lang w:eastAsia="es-ES"/>
             </w:rPr>
           </w:pPr>
-          <w:hyperlink w:anchor="_Toc215046700" w:history="1">
+          <w:hyperlink w:anchor="_Toc215418860" w:history="1">
             <w:r>
               <w:rPr>
                 <w:rStyle w:val="Hipervnculo"/>
                 <w:noProof/>
               </w:rPr>
-              <w:t>9.1 Software n</w:t>
-            </w:r>
-            <w:r>
-              <w:rPr>
-                <w:rStyle w:val="Hipervnculo"/>
-                <w:noProof/>
-              </w:rPr>
-              <w:t>e</w:t>
-            </w:r>
-            <w:r>
-              <w:rPr>
-                <w:rStyle w:val="Hipervnculo"/>
-                <w:noProof/>
-              </w:rPr>
-              <w:t>cesario</w:t>
+              <w:t>9.1 Software necesario</w:t>
             </w:r>
             <w:r>
               <w:rPr>
@@ -1591,7 +1577,7 @@
                 <w:noProof/>
                 <w:webHidden/>
               </w:rPr>
-              <w:instrText xml:space="preserve"> PAGEREF _Toc215046700 \h </w:instrText>
+              <w:instrText xml:space="preserve"> PAGEREF _Toc215418860 \h </w:instrText>
             </w:r>
             <w:r>
               <w:rPr>
@@ -1611,7 +1597,7 @@
                 <w:noProof/>
                 <w:webHidden/>
               </w:rPr>
-              <w:t>8</w:t>
+              <w:t>7</w:t>
             </w:r>
             <w:r>
               <w:rPr>
@@ -1633,10 +1619,10 @@
               <w:noProof/>
               <w:kern w:val="2"/>
               <w:szCs w:val="24"/>
-              <w:lang w:eastAsia="es-ES_tradnl"/>
+              <w:lang w:eastAsia="es-ES"/>
             </w:rPr>
           </w:pPr>
-          <w:hyperlink w:anchor="_Toc215046701" w:history="1">
+          <w:hyperlink w:anchor="_Toc215418861" w:history="1">
             <w:r>
               <w:rPr>
                 <w:rStyle w:val="Hipervnculo"/>
@@ -1663,7 +1649,7 @@
                 <w:noProof/>
                 <w:webHidden/>
               </w:rPr>
-              <w:instrText xml:space="preserve"> PAGEREF _Toc215046701 \h </w:instrText>
+              <w:instrText xml:space="preserve"> PAGEREF _Toc215418861 \h </w:instrText>
             </w:r>
             <w:r>
               <w:rPr>
@@ -1683,7 +1669,7 @@
                 <w:noProof/>
                 <w:webHidden/>
               </w:rPr>
-              <w:t>9</w:t>
+              <w:t>8</w:t>
             </w:r>
             <w:r>
               <w:rPr>
@@ -1705,10 +1691,10 @@
               <w:noProof/>
               <w:kern w:val="2"/>
               <w:szCs w:val="24"/>
-              <w:lang w:eastAsia="es-ES_tradnl"/>
+              <w:lang w:eastAsia="es-ES"/>
             </w:rPr>
           </w:pPr>
-          <w:hyperlink w:anchor="_Toc215046702" w:history="1">
+          <w:hyperlink w:anchor="_Toc215418862" w:history="1">
             <w:r>
               <w:rPr>
                 <w:rStyle w:val="Hipervnculo"/>
@@ -1735,7 +1721,7 @@
                 <w:noProof/>
                 <w:webHidden/>
               </w:rPr>
-              <w:instrText xml:space="preserve"> PAGEREF _Toc215046702 \h </w:instrText>
+              <w:instrText xml:space="preserve"> PAGEREF _Toc215418862 \h </w:instrText>
             </w:r>
             <w:r>
               <w:rPr>
@@ -1755,7 +1741,7 @@
                 <w:noProof/>
                 <w:webHidden/>
               </w:rPr>
-              <w:t>9</w:t>
+              <w:t>8</w:t>
             </w:r>
             <w:r>
               <w:rPr>
@@ -1786,7 +1772,7 @@
       <w:pPr>
         <w:pStyle w:val="Ttulo1"/>
       </w:pPr>
-      <w:bookmarkStart w:id="0" w:name="_Toc215046688"/>
+      <w:bookmarkStart w:id="0" w:name="_Toc215418848"/>
       <w:r>
         <w:lastRenderedPageBreak/>
         <w:t>1. Introducción</w:t>
@@ -1794,75 +1780,39 @@
       <w:bookmarkEnd w:id="0"/>
     </w:p>
     <w:p>
-      <w:pPr>
-        <w:rPr>
-          <w:rFonts w:ascii="Arial" w:hAnsi="Arial" w:cs="Arial"/>
-          <w:color w:val="1B1C1D"/>
-        </w:rPr>
-      </w:pPr>
-      <w:r>
-        <w:rPr>
-          <w:rStyle w:val="Textoennegrita"/>
-          <w:rFonts w:ascii="Arial" w:hAnsi="Arial" w:cs="Arial"/>
-          <w:color w:val="1B1C1D"/>
-          <w:bdr w:val="none" w:sz="0" w:space="0" w:color="auto" w:frame="1"/>
+      <w:r>
+        <w:rPr>
+          <w:b/>
+          <w:bCs/>
         </w:rPr>
         <w:t>Título:</w:t>
       </w:r>
       <w:r>
-        <w:rPr>
-          <w:rFonts w:ascii="Arial" w:hAnsi="Arial" w:cs="Arial"/>
-          <w:color w:val="1B1C1D"/>
-        </w:rPr>
         <w:t xml:space="preserve"> </w:t>
       </w:r>
       <w:proofErr w:type="spellStart"/>
       <w:r>
-        <w:rPr>
-          <w:rFonts w:ascii="Arial" w:hAnsi="Arial" w:cs="Arial"/>
-          <w:color w:val="1B1C1D"/>
-        </w:rPr>
         <w:t>SneakerHub</w:t>
       </w:r>
       <w:proofErr w:type="spellEnd"/>
       <w:r>
-        <w:rPr>
-          <w:rFonts w:ascii="Arial" w:hAnsi="Arial" w:cs="Arial"/>
-          <w:color w:val="1B1C1D"/>
-        </w:rPr>
         <w:t xml:space="preserve"> - Plataforma de Gestión y Venta de Calzado </w:t>
       </w:r>
       <w:proofErr w:type="spellStart"/>
       <w:r>
-        <w:rPr>
-          <w:rFonts w:ascii="Arial" w:hAnsi="Arial" w:cs="Arial"/>
-          <w:color w:val="1B1C1D"/>
-        </w:rPr>
         <w:t>Premiun</w:t>
       </w:r>
       <w:proofErr w:type="spellEnd"/>
     </w:p>
     <w:p>
-      <w:pPr>
-        <w:rPr>
-          <w:rFonts w:ascii="Arial" w:hAnsi="Arial" w:cs="Arial"/>
-          <w:color w:val="1B1C1D"/>
-        </w:rPr>
-      </w:pPr>
-      <w:r>
-        <w:rPr>
-          <w:rStyle w:val="Textoennegrita"/>
-          <w:rFonts w:ascii="Arial" w:hAnsi="Arial" w:cs="Arial"/>
-          <w:color w:val="1B1C1D"/>
-          <w:bdr w:val="none" w:sz="0" w:space="0" w:color="auto" w:frame="1"/>
+      <w:r>
+        <w:rPr>
+          <w:b/>
+          <w:bCs/>
         </w:rPr>
         <w:t>Descripción:</w:t>
       </w:r>
       <w:r>
-        <w:rPr>
-          <w:rFonts w:ascii="Arial" w:hAnsi="Arial" w:cs="Arial"/>
-          <w:color w:val="1B1C1D"/>
-        </w:rPr>
         <w:t xml:space="preserve"> El proyecto consiste en el desarrollo de una aplicación multiplataforma (móvil y web) dedicada al comercio electrónico de zapatillas exclusivas y comerciales. La aplicación permitirá a los usuarios finales (clientes) explorar un catálogo, gestionar un carrito de compras y realizar pedidos, mientras que los administradores podrán gestionar el inventario, los usuarios y el estado de los pedidos a través de un panel de control dedicado.</w:t>
       </w:r>
     </w:p>
@@ -1870,87 +1820,43 @@
       <w:pPr>
         <w:pStyle w:val="Ttulo1"/>
       </w:pPr>
-      <w:bookmarkStart w:id="1" w:name="_Toc215046689"/>
+      <w:bookmarkStart w:id="1" w:name="_Toc215418849"/>
       <w:r>
         <w:t>2. Justificación</w:t>
       </w:r>
       <w:bookmarkEnd w:id="1"/>
     </w:p>
     <w:p>
-      <w:pPr>
-        <w:rPr>
-          <w:rFonts w:ascii="Arial" w:hAnsi="Arial" w:cs="Arial"/>
-          <w:color w:val="1B1C1D"/>
-        </w:rPr>
-      </w:pPr>
-      <w:r>
-        <w:rPr>
-          <w:rFonts w:ascii="Arial" w:hAnsi="Arial" w:cs="Arial"/>
-          <w:color w:val="1B1C1D"/>
-        </w:rPr>
+      <w:r>
         <w:t>La venta de zapatillas (</w:t>
       </w:r>
       <w:proofErr w:type="spellStart"/>
       <w:r>
-        <w:rPr>
-          <w:rFonts w:ascii="Arial" w:hAnsi="Arial" w:cs="Arial"/>
-          <w:color w:val="1B1C1D"/>
-        </w:rPr>
         <w:t>sneakers</w:t>
       </w:r>
       <w:proofErr w:type="spellEnd"/>
       <w:r>
-        <w:rPr>
-          <w:rFonts w:ascii="Arial" w:hAnsi="Arial" w:cs="Arial"/>
-          <w:color w:val="1B1C1D"/>
-        </w:rPr>
         <w:t>) ha dejado de ser una necesidad básica para convertirse en un fenómeno de coleccionismo y moda global. Existe una necesidad creciente de plataformas que no solo vendan, sino que garanticen una gestión de stock clara y una experiencia de usuario fluida en dispositivos móviles.</w:t>
       </w:r>
     </w:p>
     <w:p>
-      <w:pPr>
-        <w:rPr>
-          <w:rFonts w:ascii="Arial" w:hAnsi="Arial" w:cs="Arial"/>
-          <w:color w:val="1B1C1D"/>
-        </w:rPr>
-      </w:pPr>
-      <w:r>
-        <w:rPr>
-          <w:rFonts w:ascii="Arial" w:hAnsi="Arial" w:cs="Arial"/>
-          <w:color w:val="1B1C1D"/>
-        </w:rPr>
+      <w:r>
         <w:t>Este proyecto es importante porque permite aplicar una arquitectura completa de software (</w:t>
       </w:r>
       <w:proofErr w:type="spellStart"/>
       <w:r>
-        <w:rPr>
-          <w:rFonts w:ascii="Arial" w:hAnsi="Arial" w:cs="Arial"/>
-          <w:color w:val="1B1C1D"/>
-        </w:rPr>
         <w:t>Frontend</w:t>
       </w:r>
       <w:proofErr w:type="spellEnd"/>
       <w:r>
-        <w:rPr>
-          <w:rFonts w:ascii="Arial" w:hAnsi="Arial" w:cs="Arial"/>
-          <w:color w:val="1B1C1D"/>
-        </w:rPr>
         <w:t xml:space="preserve">, </w:t>
       </w:r>
       <w:proofErr w:type="spellStart"/>
       <w:r>
-        <w:rPr>
-          <w:rFonts w:ascii="Arial" w:hAnsi="Arial" w:cs="Arial"/>
-          <w:color w:val="1B1C1D"/>
-        </w:rPr>
         <w:t>Backend</w:t>
       </w:r>
       <w:proofErr w:type="spellEnd"/>
       <w:r>
-        <w:rPr>
-          <w:rFonts w:ascii="Arial" w:hAnsi="Arial" w:cs="Arial"/>
-          <w:color w:val="1B1C1D"/>
-        </w:rPr>
         <w:t xml:space="preserve"> y Base de Datos) resolviendo un problema real de negocio: la digitalización de una tienda de calzado.</w:t>
       </w:r>
     </w:p>
@@ -1958,221 +1864,123 @@
       <w:pPr>
         <w:pStyle w:val="Ttulo2"/>
       </w:pPr>
-      <w:bookmarkStart w:id="2" w:name="_Toc215046690"/>
+      <w:bookmarkStart w:id="2" w:name="_Toc215418850"/>
       <w:r>
         <w:t>2.1 Estudio del arte</w:t>
       </w:r>
       <w:bookmarkEnd w:id="2"/>
     </w:p>
     <w:p>
-      <w:pPr>
-        <w:rPr>
-          <w:rFonts w:ascii="Arial" w:hAnsi="Arial" w:cs="Arial"/>
-          <w:color w:val="1B1C1D"/>
-        </w:rPr>
-      </w:pPr>
-      <w:r>
-        <w:rPr>
-          <w:rFonts w:ascii="Arial" w:hAnsi="Arial" w:cs="Arial"/>
-          <w:color w:val="1B1C1D"/>
-        </w:rPr>
+      <w:r>
         <w:t xml:space="preserve">Actualmente existen gigantes en el mercado como </w:t>
       </w:r>
       <w:r>
         <w:rPr>
-          <w:rStyle w:val="Textoennegrita"/>
-          <w:rFonts w:ascii="Arial" w:hAnsi="Arial" w:cs="Arial"/>
-          <w:color w:val="1B1C1D"/>
-          <w:bdr w:val="none" w:sz="0" w:space="0" w:color="auto" w:frame="1"/>
+          <w:b/>
+          <w:bCs/>
         </w:rPr>
         <w:t>Nike SNKRS</w:t>
       </w:r>
       <w:r>
-        <w:rPr>
-          <w:rFonts w:ascii="Arial" w:hAnsi="Arial" w:cs="Arial"/>
-          <w:color w:val="1B1C1D"/>
-        </w:rPr>
         <w:t xml:space="preserve">, </w:t>
       </w:r>
       <w:proofErr w:type="spellStart"/>
       <w:r>
         <w:rPr>
-          <w:rStyle w:val="Textoennegrita"/>
-          <w:rFonts w:ascii="Arial" w:hAnsi="Arial" w:cs="Arial"/>
-          <w:color w:val="1B1C1D"/>
-          <w:bdr w:val="none" w:sz="0" w:space="0" w:color="auto" w:frame="1"/>
+          <w:b/>
+          <w:bCs/>
         </w:rPr>
         <w:t>StockX</w:t>
       </w:r>
       <w:proofErr w:type="spellEnd"/>
       <w:r>
-        <w:rPr>
-          <w:rFonts w:ascii="Arial" w:hAnsi="Arial" w:cs="Arial"/>
-          <w:color w:val="1B1C1D"/>
-        </w:rPr>
         <w:t xml:space="preserve"> o </w:t>
       </w:r>
       <w:r>
         <w:rPr>
-          <w:rStyle w:val="Textoennegrita"/>
-          <w:rFonts w:ascii="Arial" w:hAnsi="Arial" w:cs="Arial"/>
-          <w:color w:val="1B1C1D"/>
-          <w:bdr w:val="none" w:sz="0" w:space="0" w:color="auto" w:frame="1"/>
+          <w:b/>
+          <w:bCs/>
         </w:rPr>
         <w:t>GOAT</w:t>
       </w:r>
       <w:r>
-        <w:rPr>
-          <w:rFonts w:ascii="Arial" w:hAnsi="Arial" w:cs="Arial"/>
-          <w:color w:val="1B1C1D"/>
-        </w:rPr>
         <w:t>.</w:t>
       </w:r>
     </w:p>
     <w:p>
-      <w:pPr>
-        <w:rPr>
-          <w:rFonts w:ascii="Arial" w:hAnsi="Arial" w:cs="Arial"/>
-          <w:color w:val="1B1C1D"/>
-        </w:rPr>
-      </w:pPr>
-      <w:r>
-        <w:rPr>
-          <w:rStyle w:val="Textoennegrita"/>
-          <w:rFonts w:ascii="Arial" w:hAnsi="Arial" w:cs="Arial"/>
-          <w:color w:val="1B1C1D"/>
-          <w:bdr w:val="none" w:sz="0" w:space="0" w:color="auto" w:frame="1"/>
+      <w:r>
+        <w:rPr>
+          <w:b/>
+          <w:bCs/>
         </w:rPr>
         <w:t>Nike SNKRS:</w:t>
       </w:r>
       <w:r>
-        <w:rPr>
-          <w:rFonts w:ascii="Arial" w:hAnsi="Arial" w:cs="Arial"/>
-          <w:color w:val="1B1C1D"/>
-        </w:rPr>
         <w:t xml:space="preserve"> Enfocada exclusivamente en lanzamientos de la marca.</w:t>
       </w:r>
     </w:p>
     <w:p>
-      <w:pPr>
-        <w:rPr>
-          <w:rFonts w:ascii="Arial" w:hAnsi="Arial" w:cs="Arial"/>
-          <w:color w:val="1B1C1D"/>
-        </w:rPr>
-      </w:pPr>
       <w:proofErr w:type="spellStart"/>
       <w:r>
         <w:rPr>
-          <w:rStyle w:val="Textoennegrita"/>
-          <w:rFonts w:ascii="Arial" w:hAnsi="Arial" w:cs="Arial"/>
-          <w:color w:val="1B1C1D"/>
-          <w:bdr w:val="none" w:sz="0" w:space="0" w:color="auto" w:frame="1"/>
+          <w:b/>
+          <w:bCs/>
         </w:rPr>
         <w:t>StockX</w:t>
       </w:r>
       <w:proofErr w:type="spellEnd"/>
       <w:r>
         <w:rPr>
-          <w:rStyle w:val="Textoennegrita"/>
-          <w:rFonts w:ascii="Arial" w:hAnsi="Arial" w:cs="Arial"/>
-          <w:color w:val="1B1C1D"/>
-          <w:bdr w:val="none" w:sz="0" w:space="0" w:color="auto" w:frame="1"/>
+          <w:b/>
+          <w:bCs/>
         </w:rPr>
         <w:t>/GOAT:</w:t>
       </w:r>
       <w:r>
-        <w:rPr>
-          <w:rFonts w:ascii="Arial" w:hAnsi="Arial" w:cs="Arial"/>
-          <w:color w:val="1B1C1D"/>
-        </w:rPr>
         <w:t xml:space="preserve"> Funcionan bajo modelo de reventa y subasta, con comisiones altas.</w:t>
       </w:r>
     </w:p>
     <w:p>
-      <w:pPr>
-        <w:rPr>
-          <w:rFonts w:ascii="Arial" w:hAnsi="Arial" w:cs="Arial"/>
-          <w:color w:val="1B1C1D"/>
-        </w:rPr>
-      </w:pPr>
-      <w:r>
-        <w:rPr>
-          <w:rStyle w:val="Textoennegrita"/>
-          <w:rFonts w:ascii="Arial" w:hAnsi="Arial" w:cs="Arial"/>
-          <w:color w:val="1B1C1D"/>
-          <w:bdr w:val="none" w:sz="0" w:space="0" w:color="auto" w:frame="1"/>
+      <w:r>
+        <w:rPr>
+          <w:b/>
+          <w:bCs/>
         </w:rPr>
         <w:t>Diferenciación:</w:t>
       </w:r>
       <w:r>
-        <w:rPr>
-          <w:rFonts w:ascii="Arial" w:hAnsi="Arial" w:cs="Arial"/>
-          <w:color w:val="1B1C1D"/>
-        </w:rPr>
         <w:t xml:space="preserve"> </w:t>
       </w:r>
       <w:proofErr w:type="spellStart"/>
       <w:r>
-        <w:rPr>
-          <w:rFonts w:ascii="Arial" w:hAnsi="Arial" w:cs="Arial"/>
-          <w:color w:val="1B1C1D"/>
-        </w:rPr>
         <w:t>SneakerHub</w:t>
       </w:r>
       <w:proofErr w:type="spellEnd"/>
       <w:r>
-        <w:rPr>
-          <w:rFonts w:ascii="Arial" w:hAnsi="Arial" w:cs="Arial"/>
-          <w:color w:val="1B1C1D"/>
-        </w:rPr>
         <w:t xml:space="preserve"> se diferencia al enfocarse en el modelo B2C (Business </w:t>
       </w:r>
       <w:proofErr w:type="spellStart"/>
       <w:r>
-        <w:rPr>
-          <w:rFonts w:ascii="Arial" w:hAnsi="Arial" w:cs="Arial"/>
-          <w:color w:val="1B1C1D"/>
-        </w:rPr>
         <w:t>to</w:t>
       </w:r>
       <w:proofErr w:type="spellEnd"/>
       <w:r>
-        <w:rPr>
-          <w:rFonts w:ascii="Arial" w:hAnsi="Arial" w:cs="Arial"/>
-          <w:color w:val="1B1C1D"/>
-        </w:rPr>
         <w:t xml:space="preserve"> </w:t>
       </w:r>
       <w:proofErr w:type="spellStart"/>
       <w:r>
-        <w:rPr>
-          <w:rFonts w:ascii="Arial" w:hAnsi="Arial" w:cs="Arial"/>
-          <w:color w:val="1B1C1D"/>
-        </w:rPr>
         <w:t>Consumer</w:t>
       </w:r>
       <w:proofErr w:type="spellEnd"/>
       <w:r>
-        <w:rPr>
-          <w:rFonts w:ascii="Arial" w:hAnsi="Arial" w:cs="Arial"/>
-          <w:color w:val="1B1C1D"/>
-        </w:rPr>
         <w:t xml:space="preserve">) directo, eliminando la complejidad de las subastas. Está diseñada como una solución "llave en mano" para tiendas locales que quieren dar el salto al mundo digital sin depender de </w:t>
       </w:r>
       <w:proofErr w:type="spellStart"/>
       <w:r>
-        <w:rPr>
-          <w:rFonts w:ascii="Arial" w:hAnsi="Arial" w:cs="Arial"/>
-          <w:color w:val="1B1C1D"/>
-        </w:rPr>
         <w:t>marketplaces</w:t>
       </w:r>
       <w:proofErr w:type="spellEnd"/>
       <w:r>
-        <w:rPr>
-          <w:rFonts w:ascii="Arial" w:hAnsi="Arial" w:cs="Arial"/>
-          <w:color w:val="1B1C1D"/>
-        </w:rPr>
         <w:t xml:space="preserve"> de terceros, ofreciendo un control total sobre su propio stock y clientes.</w:t>
       </w:r>
     </w:p>
@@ -2180,7 +1988,7 @@
       <w:pPr>
         <w:pStyle w:val="Ttulo1"/>
       </w:pPr>
-      <w:bookmarkStart w:id="3" w:name="_Toc215046691"/>
+      <w:bookmarkStart w:id="3" w:name="_Toc215418851"/>
       <w:r>
         <w:t>3. Objetivos</w:t>
       </w:r>
@@ -2190,7 +1998,7 @@
       <w:pPr>
         <w:pStyle w:val="Ttulo2"/>
       </w:pPr>
-      <w:bookmarkStart w:id="4" w:name="_Toc215046692"/>
+      <w:bookmarkStart w:id="4" w:name="_Toc215418852"/>
       <w:r>
         <w:t>3.1. Objetivos Generales</w:t>
       </w:r>
@@ -2207,33 +2015,12 @@
       </w:r>
     </w:p>
     <w:p>
+      <w:pPr>
+        <w:pStyle w:val="Ttulo2"/>
+      </w:pPr>
+      <w:bookmarkStart w:id="5" w:name="_Toc215418853"/>
       <w:r>
         <w:lastRenderedPageBreak/>
-        <w:t xml:space="preserve">Implementar un sistema de </w:t>
-      </w:r>
-      <w:proofErr w:type="spellStart"/>
-      <w:r>
-        <w:t>backend</w:t>
-      </w:r>
-      <w:proofErr w:type="spellEnd"/>
-      <w:r>
-        <w:t xml:space="preserve"> </w:t>
-      </w:r>
-      <w:proofErr w:type="spellStart"/>
-      <w:r>
-        <w:t>Serverless</w:t>
-      </w:r>
-      <w:proofErr w:type="spellEnd"/>
-      <w:r>
-        <w:t xml:space="preserve"> que gestione la base de datos, autenticación y almacenamiento de archivos.</w:t>
-      </w:r>
-    </w:p>
-    <w:p>
-      <w:pPr>
-        <w:pStyle w:val="Ttulo2"/>
-      </w:pPr>
-      <w:bookmarkStart w:id="5" w:name="_Toc215046693"/>
-      <w:r>
         <w:t>3.2. Objetivos Específicos</w:t>
       </w:r>
       <w:bookmarkEnd w:id="5"/>
@@ -2295,7 +2082,7 @@
       <w:pPr>
         <w:pStyle w:val="Ttulo1"/>
       </w:pPr>
-      <w:bookmarkStart w:id="6" w:name="_Toc215046694"/>
+      <w:bookmarkStart w:id="6" w:name="_Toc215418854"/>
       <w:r>
         <w:t>4. Requisitos Funcionales</w:t>
       </w:r>
@@ -2408,7 +2195,6 @@
         <w:rPr>
           <w:rStyle w:val="Textoennegrita"/>
         </w:rPr>
-        <w:lastRenderedPageBreak/>
         <w:t>RF9: Gestión de Usuarios (</w:t>
       </w:r>
       <w:proofErr w:type="spellStart"/>
@@ -2434,6 +2220,7 @@
         <w:rPr>
           <w:rStyle w:val="Textoennegrita"/>
         </w:rPr>
+        <w:lastRenderedPageBreak/>
         <w:t>RF10: Gestión de Descuentos (</w:t>
       </w:r>
       <w:proofErr w:type="spellStart"/>
@@ -2494,7 +2281,7 @@
       <w:pPr>
         <w:pStyle w:val="Ttulo1"/>
       </w:pPr>
-      <w:bookmarkStart w:id="7" w:name="_Toc215046695"/>
+      <w:bookmarkStart w:id="7" w:name="_Toc215418855"/>
       <w:r>
         <w:t>5. Lenguajes de programación a utilizar (Tecnologías)</w:t>
       </w:r>
@@ -2502,15 +2289,29 @@
     </w:p>
     <w:p>
       <w:r>
-        <w:t>Para el desarrollo de este sistema multiplataforma se ha optado por una arquitectura moderna basada en la nube (</w:t>
+        <w:rPr>
+          <w:rStyle w:val="Textoennegrita"/>
+        </w:rPr>
+        <w:t>Base de Datos</w:t>
+      </w:r>
+    </w:p>
+    <w:p>
+      <w:r>
+        <w:rPr>
+          <w:rStyle w:val="Textoennegrita"/>
+        </w:rPr>
+        <w:t>Plataforma:</w:t>
+      </w:r>
+      <w:r>
+        <w:t xml:space="preserve"> Google </w:t>
       </w:r>
       <w:proofErr w:type="spellStart"/>
       <w:r>
-        <w:t>Serverless</w:t>
+        <w:t>Firebase</w:t>
       </w:r>
       <w:proofErr w:type="spellEnd"/>
       <w:r>
-        <w:t>) y desarrollo nativo estándar:</w:t>
+        <w:t>.</w:t>
       </w:r>
     </w:p>
     <w:p>
@@ -2519,56 +2320,14 @@
         <w:rPr>
           <w:rStyle w:val="Textoennegrita"/>
         </w:rPr>
-        <w:t>Backend</w:t>
+        <w:t>Frontend</w:t>
       </w:r>
       <w:proofErr w:type="spellEnd"/>
       <w:r>
         <w:rPr>
           <w:rStyle w:val="Textoennegrita"/>
         </w:rPr>
-        <w:t xml:space="preserve"> &amp; Base de Datos (</w:t>
-      </w:r>
-      <w:proofErr w:type="spellStart"/>
-      <w:r>
-        <w:rPr>
-          <w:rStyle w:val="Textoennegrita"/>
-        </w:rPr>
-        <w:t>BaaS</w:t>
-      </w:r>
-      <w:proofErr w:type="spellEnd"/>
-      <w:r>
-        <w:rPr>
-          <w:rStyle w:val="Textoennegrita"/>
-        </w:rPr>
-        <w:t xml:space="preserve"> - </w:t>
-      </w:r>
-      <w:proofErr w:type="spellStart"/>
-      <w:r>
-        <w:rPr>
-          <w:rStyle w:val="Textoennegrita"/>
-        </w:rPr>
-        <w:t>Backend</w:t>
-      </w:r>
-      <w:proofErr w:type="spellEnd"/>
-      <w:r>
-        <w:rPr>
-          <w:rStyle w:val="Textoennegrita"/>
-        </w:rPr>
-        <w:t xml:space="preserve"> as a </w:t>
-      </w:r>
-      <w:proofErr w:type="spellStart"/>
-      <w:r>
-        <w:rPr>
-          <w:rStyle w:val="Textoennegrita"/>
-        </w:rPr>
-        <w:t>Service</w:t>
-      </w:r>
-      <w:proofErr w:type="spellEnd"/>
-      <w:r>
-        <w:rPr>
-          <w:rStyle w:val="Textoennegrita"/>
-        </w:rPr>
-        <w:t>):</w:t>
+        <w:t xml:space="preserve"> Web (Panel de Administración/Tienda Web)</w:t>
       </w:r>
     </w:p>
     <w:p>
@@ -2576,18 +2335,10 @@
         <w:rPr>
           <w:rStyle w:val="Textoennegrita"/>
         </w:rPr>
-        <w:t>Plataforma:</w:t>
-      </w:r>
-      <w:r>
-        <w:t xml:space="preserve"> Google </w:t>
-      </w:r>
-      <w:proofErr w:type="spellStart"/>
-      <w:r>
-        <w:t>Firebase</w:t>
-      </w:r>
-      <w:proofErr w:type="spellEnd"/>
-      <w:r>
-        <w:t>.</w:t>
+        <w:t>Framework:</w:t>
+      </w:r>
+      <w:r>
+        <w:t xml:space="preserve"> Angular.</w:t>
       </w:r>
     </w:p>
     <w:p>
@@ -2595,18 +2346,18 @@
         <w:rPr>
           <w:rStyle w:val="Textoennegrita"/>
         </w:rPr>
-        <w:t>Base de Datos:</w:t>
-      </w:r>
-      <w:r>
-        <w:t xml:space="preserve"> Cloud </w:t>
+        <w:t>Lenguaje:</w:t>
+      </w:r>
+      <w:r>
+        <w:t xml:space="preserve"> </w:t>
       </w:r>
       <w:proofErr w:type="spellStart"/>
       <w:r>
-        <w:t>Firestore</w:t>
+        <w:t>TypeScript</w:t>
       </w:r>
       <w:proofErr w:type="spellEnd"/>
       <w:r>
-        <w:t xml:space="preserve"> (Base de datos NoSQL orientada a documentos, en tiempo real).</w:t>
+        <w:t>.</w:t>
       </w:r>
     </w:p>
     <w:p>
@@ -2614,53 +2365,27 @@
         <w:rPr>
           <w:rStyle w:val="Textoennegrita"/>
         </w:rPr>
-        <w:t>Autenticación:</w:t>
-      </w:r>
+        <w:t>Estilos:</w:t>
+      </w:r>
+      <w:r>
+        <w:t xml:space="preserve"> CSS3 y </w:t>
+      </w:r>
+      <w:proofErr w:type="spellStart"/>
+      <w:r>
+        <w:t>framework</w:t>
+      </w:r>
+      <w:proofErr w:type="spellEnd"/>
       <w:r>
         <w:t xml:space="preserve"> </w:t>
       </w:r>
-      <w:proofErr w:type="spellStart"/>
-      <w:r>
-        <w:t>Firebase</w:t>
-      </w:r>
-      <w:proofErr w:type="spellEnd"/>
-      <w:r>
-        <w:t xml:space="preserve"> </w:t>
-      </w:r>
-      <w:proofErr w:type="spellStart"/>
-      <w:r>
-        <w:t>Authentication</w:t>
-      </w:r>
-      <w:proofErr w:type="spellEnd"/>
-      <w:r>
-        <w:t xml:space="preserve"> (Gestión de usuarios y sesiones de forma segura).</w:t>
-      </w:r>
-    </w:p>
-    <w:p>
       <w:r>
         <w:rPr>
           <w:rStyle w:val="Textoennegrita"/>
         </w:rPr>
-        <w:t>Almacenamiento:</w:t>
-      </w:r>
-      <w:r>
-        <w:t xml:space="preserve"> </w:t>
-      </w:r>
-      <w:proofErr w:type="spellStart"/>
-      <w:r>
-        <w:t>Firebase</w:t>
-      </w:r>
-      <w:proofErr w:type="spellEnd"/>
-      <w:r>
-        <w:t xml:space="preserve"> Storage (Para guardar eficientemente las imágenes de las zapatillas y otros </w:t>
-      </w:r>
-      <w:proofErr w:type="spellStart"/>
-      <w:r>
-        <w:t>assets</w:t>
-      </w:r>
-      <w:proofErr w:type="spellEnd"/>
-      <w:r>
-        <w:t>).</w:t>
+        <w:t>Bootstrap</w:t>
+      </w:r>
+      <w:r>
+        <w:t>.</w:t>
       </w:r>
     </w:p>
     <w:p>
@@ -2676,7 +2401,7 @@
         <w:rPr>
           <w:rStyle w:val="Textoennegrita"/>
         </w:rPr>
-        <w:t xml:space="preserve"> Web (Panel de Administración/Tienda Web):</w:t>
+        <w:t xml:space="preserve"> Móvil (App Cliente):</w:t>
       </w:r>
     </w:p>
     <w:p>
@@ -2684,119 +2409,13 @@
         <w:rPr>
           <w:rStyle w:val="Textoennegrita"/>
         </w:rPr>
-        <w:t>Framework:</w:t>
-      </w:r>
-      <w:r>
-        <w:t xml:space="preserve"> Angular (versión 17 o superior).</w:t>
-      </w:r>
-    </w:p>
-    <w:p>
-      <w:r>
-        <w:rPr>
-          <w:rStyle w:val="Textoennegrita"/>
-        </w:rPr>
-        <w:t>Lenguaje:</w:t>
-      </w:r>
-      <w:r>
-        <w:t xml:space="preserve"> </w:t>
-      </w:r>
-      <w:proofErr w:type="spellStart"/>
-      <w:r>
-        <w:t>TypeScript</w:t>
-      </w:r>
-      <w:proofErr w:type="spellEnd"/>
-      <w:r>
-        <w:t xml:space="preserve"> (</w:t>
-      </w:r>
-      <w:proofErr w:type="spellStart"/>
-      <w:r>
-        <w:t>Superset</w:t>
-      </w:r>
-      <w:proofErr w:type="spellEnd"/>
-      <w:r>
-        <w:t xml:space="preserve"> de JavaScript con tipado estático).</w:t>
-      </w:r>
-    </w:p>
-    <w:p>
-      <w:r>
-        <w:rPr>
-          <w:rStyle w:val="Textoennegrita"/>
-        </w:rPr>
-        <w:t>Estilos:</w:t>
-      </w:r>
-      <w:r>
-        <w:t xml:space="preserve"> CSS3 y </w:t>
-      </w:r>
-      <w:proofErr w:type="spellStart"/>
-      <w:r>
-        <w:t>framework</w:t>
-      </w:r>
-      <w:proofErr w:type="spellEnd"/>
-      <w:r>
-        <w:t xml:space="preserve"> </w:t>
-      </w:r>
-      <w:r>
-        <w:rPr>
-          <w:rStyle w:val="Textoennegrita"/>
-        </w:rPr>
-        <w:t>Bootstrap</w:t>
-      </w:r>
-      <w:r>
-        <w:t xml:space="preserve"> (para diseño responsivo y componentes visuales rápidos).</w:t>
-      </w:r>
-    </w:p>
-    <w:p>
-      <w:r>
-        <w:rPr>
-          <w:rStyle w:val="Textoennegrita"/>
-        </w:rPr>
-        <w:t>Librerías:</w:t>
-      </w:r>
-      <w:r>
-        <w:t xml:space="preserve"> </w:t>
-      </w:r>
-      <w:proofErr w:type="spellStart"/>
-      <w:r>
-        <w:t>AngularFire</w:t>
-      </w:r>
-      <w:proofErr w:type="spellEnd"/>
-      <w:r>
-        <w:t xml:space="preserve"> (para una integración fluida y reactiva con los servicios de </w:t>
-      </w:r>
-      <w:proofErr w:type="spellStart"/>
-      <w:r>
-        <w:t>Firebase</w:t>
-      </w:r>
-      <w:proofErr w:type="spellEnd"/>
-      <w:r>
-        <w:t>).</w:t>
-      </w:r>
-    </w:p>
-    <w:p>
-      <w:proofErr w:type="spellStart"/>
-      <w:r>
-        <w:rPr>
-          <w:rStyle w:val="Textoennegrita"/>
-        </w:rPr>
-        <w:t>Frontend</w:t>
-      </w:r>
-      <w:proofErr w:type="spellEnd"/>
-      <w:r>
-        <w:rPr>
-          <w:rStyle w:val="Textoennegrita"/>
-        </w:rPr>
-        <w:t xml:space="preserve"> Móvil (App Cliente):</w:t>
-      </w:r>
-    </w:p>
-    <w:p>
-      <w:r>
-        <w:rPr>
-          <w:rStyle w:val="Textoennegrita"/>
-        </w:rPr>
         <w:t>Entorno:</w:t>
       </w:r>
       <w:r>
-        <w:t xml:space="preserve"> Android Nativo.</w:t>
+        <w:t xml:space="preserve"> Androi</w:t>
+      </w:r>
+      <w:r>
+        <w:t>d.</w:t>
       </w:r>
     </w:p>
     <w:p>
@@ -2818,7 +2437,7 @@
         <w:t>Java</w:t>
       </w:r>
       <w:r>
-        <w:t xml:space="preserve"> </w:t>
+        <w:t>.</w:t>
       </w:r>
     </w:p>
     <w:p>
@@ -2848,7 +2467,15 @@
       </w:r>
       <w:proofErr w:type="spellEnd"/>
       <w:r>
-        <w:t xml:space="preserve"> Android SDK (para conectar la app nativa con los servicios de </w:t>
+        <w:t xml:space="preserve"> Android SDK (para conectar la </w:t>
+      </w:r>
+      <w:proofErr w:type="gramStart"/>
+      <w:r>
+        <w:t>app</w:t>
+      </w:r>
+      <w:proofErr w:type="gramEnd"/>
+      <w:r>
+        <w:t xml:space="preserve"> nativa con los servicios de </w:t>
       </w:r>
       <w:proofErr w:type="spellStart"/>
       <w:r>
@@ -2863,144 +2490,73 @@
       <w:pPr>
         <w:pStyle w:val="Ttulo1"/>
       </w:pPr>
-      <w:bookmarkStart w:id="8" w:name="_Toc215046696"/>
-      <w:r>
-        <w:lastRenderedPageBreak/>
+      <w:bookmarkStart w:id="8" w:name="_Toc215418856"/>
+      <w:r>
         <w:t>6. Diagrama de arquitectura</w:t>
       </w:r>
       <w:bookmarkEnd w:id="8"/>
     </w:p>
     <w:p>
-      <w:hyperlink r:id="rId10" w:history="1">
-        <w:r>
-          <w:rPr>
-            <w:rStyle w:val="Hipervnculo"/>
-          </w:rPr>
-          <w:t>https://lucid.app/lucidc</w:t>
-        </w:r>
-        <w:r>
-          <w:rPr>
-            <w:rStyle w:val="Hipervnculo"/>
-          </w:rPr>
-          <w:t>h</w:t>
-        </w:r>
-        <w:r>
-          <w:rPr>
-            <w:rStyle w:val="Hipervnculo"/>
-          </w:rPr>
-          <w:t>art/4a661e78-fc1f-4156-b4ed-5aaa6c34db94/edit?viewport_loc=-15112%2C-4287%2C18488%2C10350%2C0_0&amp;invitationId=inv_28a234da-59ee-435f-86ea-a5a0a3d38dcf</w:t>
-        </w:r>
-      </w:hyperlink>
+      <w:pPr>
+        <w:rPr>
+          <w:rFonts w:ascii="Arial" w:hAnsi="Arial" w:cs="Arial"/>
+          <w:color w:val="1B1C1D"/>
+        </w:rPr>
+      </w:pPr>
+      <w:r>
+        <w:t xml:space="preserve">Se plantea una arquitectura </w:t>
+      </w:r>
+      <w:r>
+        <w:t>basada</w:t>
+      </w:r>
+      <w:r>
+        <w:rPr>
+          <w:rFonts w:ascii="Arial" w:hAnsi="Arial" w:cs="Arial"/>
+          <w:color w:val="1B1C1D"/>
+        </w:rPr>
+        <w:t xml:space="preserve"> en</w:t>
+      </w:r>
+      <w:r>
+        <w:rPr>
+          <w:b/>
+          <w:bCs/>
+        </w:rPr>
+        <w:t xml:space="preserve"> </w:t>
+      </w:r>
+      <w:r>
+        <w:t>un servidor</w:t>
+      </w:r>
+      <w:r>
+        <w:rPr>
+          <w:b/>
+          <w:bCs/>
+        </w:rPr>
+        <w:t xml:space="preserve"> </w:t>
+      </w:r>
+      <w:proofErr w:type="spellStart"/>
+      <w:r>
+        <w:t>bbdd</w:t>
+      </w:r>
+      <w:proofErr w:type="spellEnd"/>
+      <w:r>
+        <w:t xml:space="preserve"> en el que se conecten </w:t>
+      </w:r>
+      <w:proofErr w:type="gramStart"/>
+      <w:r>
+        <w:t>ambas app</w:t>
+      </w:r>
+      <w:proofErr w:type="gramEnd"/>
+      <w:r>
+        <w:t>, tanto web como móvil.</w:t>
+      </w:r>
     </w:p>
     <w:p>
       <w:pPr>
-        <w:rPr>
-          <w:rFonts w:ascii="Arial" w:hAnsi="Arial" w:cs="Arial"/>
-          <w:color w:val="1B1C1D"/>
-        </w:rPr>
-      </w:pPr>
-      <w:r>
-        <w:rPr>
-          <w:rFonts w:ascii="Arial" w:hAnsi="Arial" w:cs="Arial"/>
-          <w:color w:val="1B1C1D"/>
-        </w:rPr>
-        <w:t xml:space="preserve">Se plantea una arquitectura </w:t>
-      </w:r>
-      <w:r>
-        <w:rPr>
-          <w:rStyle w:val="Textoennegrita"/>
-          <w:rFonts w:ascii="Arial" w:hAnsi="Arial" w:cs="Arial"/>
-          <w:color w:val="1B1C1D"/>
-          <w:bdr w:val="none" w:sz="0" w:space="0" w:color="auto" w:frame="1"/>
-        </w:rPr>
-        <w:t>Cliente-Servidor</w:t>
-      </w:r>
-      <w:r>
-        <w:rPr>
-          <w:rFonts w:ascii="Arial" w:hAnsi="Arial" w:cs="Arial"/>
-          <w:color w:val="1B1C1D"/>
-        </w:rPr>
-        <w:t xml:space="preserve"> basada en servicios REST.</w:t>
-      </w:r>
-    </w:p>
-    <w:p>
-      <w:pPr>
-        <w:rPr>
-          <w:rFonts w:ascii="Arial" w:hAnsi="Arial" w:cs="Arial"/>
-          <w:color w:val="1B1C1D"/>
-        </w:rPr>
-      </w:pPr>
-      <w:r>
-        <w:rPr>
-          <w:rStyle w:val="Textoennegrita"/>
-          <w:rFonts w:ascii="Arial" w:hAnsi="Arial" w:cs="Arial"/>
-          <w:color w:val="1B1C1D"/>
-          <w:bdr w:val="none" w:sz="0" w:space="0" w:color="auto" w:frame="1"/>
-        </w:rPr>
-        <w:t>Cliente Móvil:</w:t>
-      </w:r>
-      <w:r>
-        <w:rPr>
-          <w:rFonts w:ascii="Arial" w:hAnsi="Arial" w:cs="Arial"/>
-          <w:color w:val="1B1C1D"/>
-        </w:rPr>
-        <w:t xml:space="preserve"> Consume la API mediante peticiones HTTP (GET, POST, PUT, DELETE).</w:t>
-      </w:r>
-    </w:p>
-    <w:p>
-      <w:pPr>
-        <w:rPr>
-          <w:rFonts w:ascii="Arial" w:hAnsi="Arial" w:cs="Arial"/>
-          <w:color w:val="1B1C1D"/>
-        </w:rPr>
-      </w:pPr>
-      <w:r>
-        <w:rPr>
-          <w:rStyle w:val="Textoennegrita"/>
-          <w:rFonts w:ascii="Arial" w:hAnsi="Arial" w:cs="Arial"/>
-          <w:color w:val="1B1C1D"/>
-          <w:bdr w:val="none" w:sz="0" w:space="0" w:color="auto" w:frame="1"/>
-        </w:rPr>
-        <w:t>Servidor:</w:t>
-      </w:r>
-      <w:r>
-        <w:rPr>
-          <w:rFonts w:ascii="Arial" w:hAnsi="Arial" w:cs="Arial"/>
-          <w:color w:val="1B1C1D"/>
-        </w:rPr>
-        <w:t xml:space="preserve"> Procesa las peticiones, aplica la lógica de negocio y conecta con la BBDD.</w:t>
-      </w:r>
-    </w:p>
-    <w:p>
-      <w:pPr>
-        <w:rPr>
-          <w:rFonts w:ascii="Arial" w:hAnsi="Arial" w:cs="Arial"/>
-          <w:color w:val="1B1C1D"/>
-        </w:rPr>
-      </w:pPr>
-      <w:r>
-        <w:rPr>
-          <w:rStyle w:val="Textoennegrita"/>
-          <w:rFonts w:ascii="Arial" w:hAnsi="Arial" w:cs="Arial"/>
-          <w:color w:val="1B1C1D"/>
-          <w:bdr w:val="none" w:sz="0" w:space="0" w:color="auto" w:frame="1"/>
-        </w:rPr>
-        <w:t>Base de Datos:</w:t>
-      </w:r>
-      <w:r>
-        <w:rPr>
-          <w:rFonts w:ascii="Arial" w:hAnsi="Arial" w:cs="Arial"/>
-          <w:color w:val="1B1C1D"/>
-        </w:rPr>
-        <w:t xml:space="preserve"> Almacena la información de forma persistente.</w:t>
-      </w:r>
-    </w:p>
-    <w:p>
-      <w:pPr>
         <w:pStyle w:val="Ttulo1"/>
       </w:pPr>
-      <w:bookmarkStart w:id="9" w:name="_Toc215046697"/>
-      <w:r>
+      <w:bookmarkStart w:id="9" w:name="_Toc215418857"/>
+      <w:r>
+        <w:lastRenderedPageBreak/>
         <w:t>7. Diagrama de clases</w:t>
       </w:r>
       <w:bookmarkEnd w:id="9"/>
@@ -3015,45 +2571,13 @@
       <w:r>
         <w:rPr>
           <w:rFonts w:ascii="Arial" w:hAnsi="Arial" w:cs="Arial"/>
-          <w:color w:val="1B1C1D"/>
-        </w:rPr>
-        <w:t xml:space="preserve">A </w:t>
-      </w:r>
-      <w:proofErr w:type="gramStart"/>
-      <w:r>
-        <w:rPr>
-          <w:rFonts w:ascii="Arial" w:hAnsi="Arial" w:cs="Arial"/>
-          <w:color w:val="1B1C1D"/>
-        </w:rPr>
-        <w:t>continuación</w:t>
-      </w:r>
-      <w:proofErr w:type="gramEnd"/>
-      <w:r>
-        <w:rPr>
-          <w:rFonts w:ascii="Arial" w:hAnsi="Arial" w:cs="Arial"/>
-          <w:color w:val="1B1C1D"/>
-        </w:rPr>
-        <w:t xml:space="preserve"> se muestra el diseño orientado a objetos que sustenta la lógica de la aplicación:</w:t>
-      </w:r>
-    </w:p>
-    <w:p>
-      <w:pPr>
-        <w:rPr>
-          <w:rFonts w:ascii="Arial" w:hAnsi="Arial" w:cs="Arial"/>
-          <w:color w:val="1B1C1D"/>
-        </w:rPr>
-      </w:pPr>
-      <w:r>
-        <w:rPr>
-          <w:rFonts w:ascii="Arial" w:hAnsi="Arial" w:cs="Arial"/>
           <w:noProof/>
           <w:color w:val="1B1C1D"/>
         </w:rPr>
-        <w:lastRenderedPageBreak/>
         <w:drawing>
-          <wp:inline distT="0" distB="0" distL="0" distR="0">
-            <wp:extent cx="4631821" cy="9151244"/>
-            <wp:effectExtent l="0" t="0" r="3810" b="5715"/>
+          <wp:inline distT="0" distB="0" distL="0" distR="0" wp14:anchorId="509AA1D4" wp14:editId="1B33550D">
+            <wp:extent cx="4213144" cy="8324049"/>
+            <wp:effectExtent l="0" t="0" r="0" b="1270"/>
             <wp:docPr id="1862209462" name="Imagen 1" descr="Diagrama&#10;&#10;El contenido generado por IA puede ser incorrecto."/>
             <wp:cNvGraphicFramePr>
               <a:graphicFrameLocks xmlns:a="http://schemas.openxmlformats.org/drawingml/2006/main" noChangeAspect="1"/>
@@ -3066,7 +2590,7 @@
                     <pic:cNvPicPr/>
                   </pic:nvPicPr>
                   <pic:blipFill>
-                    <a:blip r:embed="rId11" cstate="print">
+                    <a:blip r:embed="rId10" cstate="print">
                       <a:extLst>
                         <a:ext uri="{28A0092B-C50C-407E-A947-70E740481C1C}">
                           <a14:useLocalDpi xmlns:a14="http://schemas.microsoft.com/office/drawing/2010/main" val="0"/>
@@ -3080,7 +2604,7 @@
                   <pic:spPr>
                     <a:xfrm>
                       <a:off x="0" y="0"/>
-                      <a:ext cx="4671713" cy="9230060"/>
+                      <a:ext cx="4253012" cy="8402818"/>
                     </a:xfrm>
                     <a:prstGeom prst="rect">
                       <a:avLst/>
@@ -3097,7 +2621,7 @@
       <w:pPr>
         <w:pStyle w:val="Ttulo1"/>
       </w:pPr>
-      <w:bookmarkStart w:id="10" w:name="_Toc215046698"/>
+      <w:bookmarkStart w:id="10" w:name="_Toc215418858"/>
       <w:r>
         <w:lastRenderedPageBreak/>
         <w:t>8. Modelo entidad-relación</w:t>
@@ -3105,27 +2629,12 @@
       <w:bookmarkEnd w:id="10"/>
     </w:p>
     <w:p>
-      <w:pPr>
-        <w:rPr>
-          <w:rFonts w:ascii="Arial" w:hAnsi="Arial" w:cs="Arial"/>
-          <w:color w:val="1B1C1D"/>
-        </w:rPr>
-      </w:pPr>
-      <w:r>
-        <w:rPr>
-          <w:rFonts w:ascii="Arial" w:hAnsi="Arial" w:cs="Arial"/>
-          <w:color w:val="1B1C1D"/>
-        </w:rPr>
-        <w:t>Este diagrama representa la estructura física de la base de datos relacional, basada en las entidades definidas:</w:t>
-      </w:r>
-    </w:p>
-    <w:p>
       <w:r>
         <w:rPr>
           <w:noProof/>
         </w:rPr>
         <w:drawing>
-          <wp:inline distT="0" distB="0" distL="0" distR="0">
+          <wp:inline distT="0" distB="0" distL="0" distR="0" wp14:anchorId="2947E750" wp14:editId="4681AEA5">
             <wp:extent cx="5400040" cy="4474845"/>
             <wp:effectExtent l="0" t="0" r="0" b="0"/>
             <wp:docPr id="1668211100" name="Imagen 2" descr="Diagrama&#10;&#10;El contenido generado por IA puede ser incorrecto."/>
@@ -3140,7 +2649,7 @@
                     <pic:cNvPicPr/>
                   </pic:nvPicPr>
                   <pic:blipFill>
-                    <a:blip r:embed="rId12" cstate="print">
+                    <a:blip r:embed="rId11" cstate="print">
                       <a:extLst>
                         <a:ext uri="{28A0092B-C50C-407E-A947-70E740481C1C}">
                           <a14:useLocalDpi xmlns:a14="http://schemas.microsoft.com/office/drawing/2010/main" val="0"/>
@@ -3171,7 +2680,7 @@
       <w:pPr>
         <w:pStyle w:val="Ttulo1"/>
       </w:pPr>
-      <w:bookmarkStart w:id="11" w:name="_Toc215046699"/>
+      <w:bookmarkStart w:id="11" w:name="_Toc215418859"/>
       <w:r>
         <w:t>9. Entornos de aplicación del proyecto</w:t>
       </w:r>
@@ -3181,7 +2690,7 @@
       <w:pPr>
         <w:pStyle w:val="Ttulo2"/>
       </w:pPr>
-      <w:bookmarkStart w:id="12" w:name="_Toc215046700"/>
+      <w:bookmarkStart w:id="12" w:name="_Toc215418860"/>
       <w:r>
         <w:t>9.1 Software necesario</w:t>
       </w:r>
@@ -3328,7 +2837,6 @@
           <w:bCs/>
           <w:lang w:eastAsia="es-ES_tradnl"/>
         </w:rPr>
-        <w:lastRenderedPageBreak/>
         <w:t>Firebase</w:t>
       </w:r>
       <w:proofErr w:type="spellEnd"/>
@@ -3338,264 +2846,142 @@
           <w:bCs/>
           <w:lang w:eastAsia="es-ES_tradnl"/>
         </w:rPr>
-        <w:t xml:space="preserve"> </w:t>
-      </w:r>
-      <w:proofErr w:type="spellStart"/>
+        <w:t>:</w:t>
+      </w:r>
+      <w:r>
+        <w:rPr>
+          <w:lang w:eastAsia="es-ES_tradnl"/>
+        </w:rPr>
+        <w:t xml:space="preserve"> Interfaz web para gestionar la base de datos, ver usuarios registrados y configurar reglas de seguridad.</w:t>
+      </w:r>
+    </w:p>
+    <w:p>
+      <w:pPr>
+        <w:rPr>
+          <w:lang w:eastAsia="es-ES_tradnl"/>
+        </w:rPr>
+      </w:pPr>
       <w:r>
         <w:rPr>
           <w:b/>
           <w:bCs/>
           <w:lang w:eastAsia="es-ES_tradnl"/>
         </w:rPr>
-        <w:t>Console</w:t>
-      </w:r>
-      <w:proofErr w:type="spellEnd"/>
+        <w:lastRenderedPageBreak/>
+        <w:t>Git &amp; GitHub/</w:t>
+      </w:r>
+      <w:proofErr w:type="spellStart"/>
       <w:r>
         <w:rPr>
           <w:b/>
           <w:bCs/>
           <w:lang w:eastAsia="es-ES_tradnl"/>
         </w:rPr>
-        <w:t>:</w:t>
-      </w:r>
-      <w:r>
-        <w:rPr>
-          <w:lang w:eastAsia="es-ES_tradnl"/>
-        </w:rPr>
-        <w:t xml:space="preserve"> Interfaz web para gestionar la base de datos, ver usuarios registrados y configurar reglas de seguridad.</w:t>
-      </w:r>
-    </w:p>
-    <w:p>
-      <w:pPr>
-        <w:rPr>
-          <w:lang w:eastAsia="es-ES_tradnl"/>
-        </w:rPr>
-      </w:pPr>
+        <w:t>GitLab</w:t>
+      </w:r>
+      <w:proofErr w:type="spellEnd"/>
       <w:r>
         <w:rPr>
           <w:b/>
           <w:bCs/>
           <w:lang w:eastAsia="es-ES_tradnl"/>
         </w:rPr>
-        <w:t>Git &amp; GitHub/</w:t>
-      </w:r>
-      <w:proofErr w:type="spellStart"/>
+        <w:t>:</w:t>
+      </w:r>
+      <w:r>
+        <w:rPr>
+          <w:lang w:eastAsia="es-ES_tradnl"/>
+        </w:rPr>
+        <w:t xml:space="preserve"> Para el control de versiones del código fuente.</w:t>
+      </w:r>
+    </w:p>
+    <w:p>
+      <w:pPr>
+        <w:pStyle w:val="Ttulo2"/>
+      </w:pPr>
+      <w:bookmarkStart w:id="13" w:name="_Toc215418861"/>
+      <w:r>
+        <w:t>9.2 Hardware necesario</w:t>
+      </w:r>
+      <w:bookmarkEnd w:id="13"/>
+    </w:p>
+    <w:p>
+      <w:pPr>
+        <w:rPr>
+          <w:lang w:eastAsia="es-ES_tradnl"/>
+        </w:rPr>
+      </w:pPr>
       <w:r>
         <w:rPr>
           <w:b/>
           <w:bCs/>
           <w:lang w:eastAsia="es-ES_tradnl"/>
         </w:rPr>
-        <w:t>GitLab</w:t>
+        <w:t>Ordenador de desarrollo:</w:t>
+      </w:r>
+      <w:r>
+        <w:rPr>
+          <w:lang w:eastAsia="es-ES_tradnl"/>
+        </w:rPr>
+        <w:t xml:space="preserve"> Con capacidad suficiente para ejecutar los </w:t>
+      </w:r>
+      <w:proofErr w:type="spellStart"/>
+      <w:r>
+        <w:rPr>
+          <w:lang w:eastAsia="es-ES_tradnl"/>
+        </w:rPr>
+        <w:t>IDEs</w:t>
       </w:r>
       <w:proofErr w:type="spellEnd"/>
+      <w:r>
+        <w:rPr>
+          <w:lang w:eastAsia="es-ES_tradnl"/>
+        </w:rPr>
+        <w:t xml:space="preserve"> y emuladores (mínimo 16GB RAM recomendado).</w:t>
+      </w:r>
+    </w:p>
+    <w:p>
+      <w:pPr>
+        <w:rPr>
+          <w:lang w:eastAsia="es-ES_tradnl"/>
+        </w:rPr>
+      </w:pPr>
       <w:r>
         <w:rPr>
           <w:b/>
           <w:bCs/>
           <w:lang w:eastAsia="es-ES_tradnl"/>
         </w:rPr>
-        <w:t>:</w:t>
+        <w:t>Dispositivo móvil:</w:t>
       </w:r>
       <w:r>
         <w:rPr>
           <w:lang w:eastAsia="es-ES_tradnl"/>
         </w:rPr>
-        <w:t xml:space="preserve"> Para el control de versiones del código fuente.</w:t>
+        <w:t xml:space="preserve"> Android para pruebas físicas de la aplicación</w:t>
       </w:r>
     </w:p>
     <w:p>
       <w:pPr>
-        <w:pStyle w:val="Ttulo2"/>
-      </w:pPr>
-      <w:bookmarkStart w:id="13" w:name="_Toc215046701"/>
-      <w:r>
-        <w:t>9.2 Hardware necesario</w:t>
-      </w:r>
-      <w:bookmarkEnd w:id="13"/>
-    </w:p>
-    <w:p>
-      <w:pPr>
-        <w:rPr>
-          <w:rFonts w:ascii="Arial" w:hAnsi="Arial" w:cs="Arial"/>
-          <w:color w:val="1B1C1D"/>
-        </w:rPr>
-      </w:pPr>
-      <w:r>
-        <w:rPr>
-          <w:rStyle w:val="Textoennegrita"/>
-          <w:rFonts w:ascii="Arial" w:hAnsi="Arial" w:cs="Arial"/>
-          <w:color w:val="1B1C1D"/>
-          <w:bdr w:val="none" w:sz="0" w:space="0" w:color="auto" w:frame="1"/>
-        </w:rPr>
-        <w:t>Ordenador de desarrollo:</w:t>
-      </w:r>
-      <w:r>
-        <w:rPr>
-          <w:rFonts w:ascii="Arial" w:hAnsi="Arial" w:cs="Arial"/>
-          <w:color w:val="1B1C1D"/>
-        </w:rPr>
-        <w:t xml:space="preserve"> Con capacidad suficiente para ejecutar los </w:t>
-      </w:r>
-      <w:proofErr w:type="spellStart"/>
-      <w:r>
-        <w:rPr>
-          <w:rFonts w:ascii="Arial" w:hAnsi="Arial" w:cs="Arial"/>
-          <w:color w:val="1B1C1D"/>
-        </w:rPr>
-        <w:t>IDEs</w:t>
-      </w:r>
-      <w:proofErr w:type="spellEnd"/>
-      <w:r>
-        <w:rPr>
-          <w:rFonts w:ascii="Arial" w:hAnsi="Arial" w:cs="Arial"/>
-          <w:color w:val="1B1C1D"/>
-        </w:rPr>
-        <w:t xml:space="preserve"> y emuladores (mínimo 16GB RAM recomendado).</w:t>
-      </w:r>
-    </w:p>
-    <w:p>
-      <w:pPr>
-        <w:rPr>
-          <w:rFonts w:ascii="Arial" w:hAnsi="Arial" w:cs="Arial"/>
-          <w:color w:val="1B1C1D"/>
-        </w:rPr>
-      </w:pPr>
-      <w:r>
-        <w:rPr>
-          <w:rStyle w:val="Textoennegrita"/>
-          <w:rFonts w:ascii="Arial" w:hAnsi="Arial" w:cs="Arial"/>
-          <w:color w:val="1B1C1D"/>
-          <w:bdr w:val="none" w:sz="0" w:space="0" w:color="auto" w:frame="1"/>
-        </w:rPr>
-        <w:t>Dispositivo móvil:</w:t>
-      </w:r>
-      <w:r>
-        <w:rPr>
-          <w:rFonts w:ascii="Arial" w:hAnsi="Arial" w:cs="Arial"/>
-          <w:color w:val="1B1C1D"/>
-        </w:rPr>
-        <w:t xml:space="preserve"> Android para pruebas físicas de la aplicación</w:t>
-      </w:r>
-    </w:p>
-    <w:p>
-      <w:pPr>
         <w:pStyle w:val="Ttulo1"/>
       </w:pPr>
-      <w:bookmarkStart w:id="14" w:name="_Toc215046702"/>
+      <w:bookmarkStart w:id="14" w:name="_Toc215418862"/>
       <w:r>
         <w:t>10. Prototipo de Interfaz de usuario</w:t>
       </w:r>
       <w:bookmarkEnd w:id="14"/>
     </w:p>
     <w:p>
-      <w:pPr>
-        <w:rPr>
-          <w:rFonts w:ascii="Arial" w:hAnsi="Arial" w:cs="Arial"/>
-          <w:color w:val="1B1C1D"/>
-        </w:rPr>
-      </w:pPr>
-      <w:r>
-        <w:rPr>
-          <w:rStyle w:val="Textoennegrita"/>
-          <w:rFonts w:ascii="Arial" w:hAnsi="Arial" w:cs="Arial"/>
-          <w:color w:val="1B1C1D"/>
-          <w:bdr w:val="none" w:sz="0" w:space="0" w:color="auto" w:frame="1"/>
-        </w:rPr>
-        <w:t>Home (Catálogo):</w:t>
-      </w:r>
-      <w:r>
-        <w:rPr>
-          <w:rFonts w:ascii="Arial" w:hAnsi="Arial" w:cs="Arial"/>
-          <w:color w:val="1B1C1D"/>
-        </w:rPr>
-        <w:t xml:space="preserve"> </w:t>
-      </w:r>
-      <w:proofErr w:type="spellStart"/>
-      <w:r>
-        <w:rPr>
-          <w:rFonts w:ascii="Arial" w:hAnsi="Arial" w:cs="Arial"/>
-          <w:color w:val="1B1C1D"/>
-        </w:rPr>
-        <w:t>Grid</w:t>
-      </w:r>
-      <w:proofErr w:type="spellEnd"/>
-      <w:r>
-        <w:rPr>
-          <w:rFonts w:ascii="Arial" w:hAnsi="Arial" w:cs="Arial"/>
-          <w:color w:val="1B1C1D"/>
-        </w:rPr>
-        <w:t xml:space="preserve"> de imágenes de zapatillas con precio y nombre. Barra de búsqueda superior.</w:t>
-      </w:r>
+      <w:hyperlink r:id="rId12" w:history="1">
+        <w:r>
+          <w:rPr>
+            <w:rStyle w:val="Hipervnculo"/>
+          </w:rPr>
+          <w:t>https://www.figma.com/design/Y08thPLeOAKkqbVpUkeBOZ/Proyecto-TFG?node-id=0-1&amp;t=K0MixZifuoiUvE8d-1</w:t>
+        </w:r>
+      </w:hyperlink>
     </w:p>
-    <w:p>
-      <w:pPr>
-        <w:rPr>
-          <w:rFonts w:ascii="Arial" w:hAnsi="Arial" w:cs="Arial"/>
-          <w:color w:val="1B1C1D"/>
-        </w:rPr>
-      </w:pPr>
-      <w:r>
-        <w:rPr>
-          <w:rStyle w:val="Textoennegrita"/>
-          <w:rFonts w:ascii="Arial" w:hAnsi="Arial" w:cs="Arial"/>
-          <w:color w:val="1B1C1D"/>
-          <w:bdr w:val="none" w:sz="0" w:space="0" w:color="auto" w:frame="1"/>
-        </w:rPr>
-        <w:t>Detalle de Producto:</w:t>
-      </w:r>
-      <w:r>
-        <w:rPr>
-          <w:rFonts w:ascii="Arial" w:hAnsi="Arial" w:cs="Arial"/>
-          <w:color w:val="1B1C1D"/>
-        </w:rPr>
-        <w:t xml:space="preserve"> Foto grande de la zapatilla, selector de talla, descripción y botón "Añadir al carrito".</w:t>
-      </w:r>
-    </w:p>
-    <w:p>
-      <w:pPr>
-        <w:rPr>
-          <w:rFonts w:ascii="Arial" w:hAnsi="Arial" w:cs="Arial"/>
-          <w:color w:val="1B1C1D"/>
-        </w:rPr>
-      </w:pPr>
-      <w:r>
-        <w:rPr>
-          <w:rStyle w:val="Textoennegrita"/>
-          <w:rFonts w:ascii="Arial" w:hAnsi="Arial" w:cs="Arial"/>
-          <w:color w:val="1B1C1D"/>
-          <w:bdr w:val="none" w:sz="0" w:space="0" w:color="auto" w:frame="1"/>
-        </w:rPr>
-        <w:t>Panel Adm</w:t>
-      </w:r>
-      <w:proofErr w:type="spellStart"/>
-      <w:r>
-        <w:rPr>
-          <w:rStyle w:val="Textoennegrita"/>
-          <w:rFonts w:ascii="Arial" w:hAnsi="Arial" w:cs="Arial"/>
-          <w:color w:val="1B1C1D"/>
-          <w:bdr w:val="none" w:sz="0" w:space="0" w:color="auto" w:frame="1"/>
-        </w:rPr>
-        <w:t>in</w:t>
-      </w:r>
-      <w:proofErr w:type="spellEnd"/>
-      <w:r>
-        <w:rPr>
-          <w:rStyle w:val="Textoennegrita"/>
-          <w:rFonts w:ascii="Arial" w:hAnsi="Arial" w:cs="Arial"/>
-          <w:color w:val="1B1C1D"/>
-          <w:bdr w:val="none" w:sz="0" w:space="0" w:color="auto" w:frame="1"/>
-        </w:rPr>
-        <w:t>:</w:t>
-      </w:r>
-      <w:r>
-        <w:rPr>
-          <w:rFonts w:ascii="Arial" w:hAnsi="Arial" w:cs="Arial"/>
-          <w:color w:val="1B1C1D"/>
-        </w:rPr>
-        <w:t xml:space="preserve"> Tabla con listado de productos y botones de editar/borrar.</w:t>
-      </w:r>
-    </w:p>
+    <w:p/>
     <w:sectPr>
       <w:headerReference w:type="default" r:id="rId13"/>
       <w:footerReference w:type="default" r:id="rId14"/>
@@ -3663,7 +3049,7 @@
           <mc:AlternateContent>
             <mc:Choice Requires="wps">
               <w:drawing>
-                <wp:anchor distT="0" distB="0" distL="114300" distR="114300" simplePos="0" relativeHeight="251659264" behindDoc="1" locked="0" layoutInCell="1" allowOverlap="1" wp14:anchorId="2E65A928" wp14:editId="0D17386E">
+                <wp:anchor distT="0" distB="0" distL="114300" distR="114300" simplePos="0" relativeHeight="251659264" behindDoc="1" locked="0" layoutInCell="1" allowOverlap="1" wp14:anchorId="78D36460" wp14:editId="60BEB2CE">
                   <wp:simplePos x="0" y="0"/>
                   <wp:positionH relativeFrom="rightMargin">
                     <wp:posOffset>0</wp:posOffset>
@@ -3745,7 +3131,7 @@
                     <v:h position="#0,topLeft" xrange="0,21600"/>
                   </v:handles>
                 </v:shapetype>
-                <v:shape id="Isosceles Triangle 5" o:spid="_x0000_s1026" type="#_x0000_t5" style="position:absolute;margin-left:0;margin-top:-6.1pt;width:84.95pt;height:70.5pt;flip:x;z-index:-251657216;visibility:visible;mso-wrap-style:square;mso-width-percent:0;mso-height-percent:0;mso-wrap-distance-left:9pt;mso-wrap-distance-top:0;mso-wrap-distance-right:9pt;mso-wrap-distance-bottom:0;mso-position-horizontal:absolute;mso-position-horizontal-relative:right-margin-area;mso-position-vertical:absolute;mso-position-vertical-relative:text;mso-width-percent:0;mso-height-percent:0;mso-width-relative:margin;mso-height-relative:margin;v-text-anchor:middle" o:gfxdata="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" adj="0" fillcolor="#00c" stroked="f" strokeweight="1pt">
+                <v:shape id="Isosceles Triangle 5" o:spid="_x0000_s1026" type="#_x0000_t5" style="position:absolute;margin-left:0;margin-top:-6.1pt;width:84.95pt;height:70.5pt;flip:x;z-index:-251657216;visibility:visible;mso-wrap-style:square;mso-width-percent:0;mso-height-percent:0;mso-wrap-distance-left:9pt;mso-wrap-distance-top:0;mso-wrap-distance-right:9pt;mso-wrap-distance-bottom:0;mso-position-horizontal:absolute;mso-position-horizontal-relative:right-margin-area;mso-position-vertical:absolute;mso-position-vertical-relative:text;mso-width-percent:0;mso-height-percent:0;mso-width-relative:margin;mso-height-relative:margin;v-text-anchor:middle" o:gfxdata="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" adj="0" fillcolor="#00c" stroked="f" strokeweight="1pt">
                   <w10:wrap anchorx="margin"/>
                 </v:shape>
               </w:pict>

</xml_diff>